<commit_message>
docs: integrar modulo de servidor backend e iniciar_backend.bat en documento de explicacion tecnica v1.1.0
</commit_message>
<xml_diff>
--- a/EXPLICACION_TECNICA_DESARROLLOS_SIEMBRAS.docx
+++ b/EXPLICACION_TECNICA_DESARROLLOS_SIEMBRAS.docx
@@ -4,7 +4,7 @@
   <w:body>
     <w:p>
       <w:pPr>
-        <w:jc w:val="right"/>
+        <w:spacing w:before="0" w:after="40"/>
       </w:pPr>
       <w:r>
         <w:rPr>
@@ -14,20 +14,18 @@
           <w:sz w:val="17"/>
         </w:rPr>
         <w:t>BUENAVISTA FLOWERS • DEPARTAMENTO DE TECNOLOGÍA E INNOVACIÓN</w:t>
-        <w:br/>
       </w:r>
     </w:p>
     <w:p>
       <w:pPr>
-        <w:spacing w:before="280" w:after="120"/>
-        <w:jc w:val="center"/>
+        <w:spacing w:before="80" w:after="120"/>
       </w:pPr>
       <w:r>
         <w:rPr>
           <w:rFonts w:ascii="Arial" w:hAnsi="Arial"/>
           <w:b/>
           <w:color w:val="1B5E20"/>
-          <w:sz w:val="36"/>
+          <w:sz w:val="35"/>
         </w:rPr>
         <w:t>INFORME DE INGENIERÍA Y ANÁLISIS DE IMPACTO TÉCNICO</w:t>
         <w:br/>
@@ -36,18 +34,18 @@
     </w:p>
     <w:p>
       <w:pPr>
-        <w:spacing w:after="320"/>
-        <w:jc w:val="center"/>
+        <w:spacing w:before="0" w:after="240"/>
       </w:pPr>
       <w:r>
         <w:rPr>
           <w:rFonts w:ascii="Arial" w:hAnsi="Arial"/>
+          <w:i/>
           <w:color w:val="37474F"/>
-          <w:sz w:val="22"/>
+          <w:sz w:val="21"/>
         </w:rPr>
-        <w:t>Desglose Funcional, Justificación Agronómica, Mecánica de Operación</w:t>
+        <w:t>Desglose Funcional, Justificación Agronómica, Mecánica de Operación, Arquitectura Backend</w:t>
         <w:br/>
-        <w:t>y Análisis de Riesgo Operativo (Qué Pasa si se Quita) para Cada Componente</w:t>
+        <w:t>y Análisis de Riesgo Operativo (¿Qué Pasa si se Quita?) para Cada Componente del Ecosistema</w:t>
       </w:r>
     </w:p>
     <w:tbl>
@@ -74,15 +72,12 @@
             </w:tcMar>
           </w:tcPr>
           <w:p>
-            <w:pPr>
-              <w:spacing w:before="40" w:after="40"/>
-            </w:pPr>
             <w:r>
               <w:rPr>
                 <w:rFonts w:ascii="Arial" w:hAnsi="Arial"/>
                 <w:b/>
                 <w:color w:val="1B5E20"/>
-                <w:sz w:val="19"/>
+                <w:sz w:val="18"/>
               </w:rPr>
               <w:t>Proyecto / Sistema</w:t>
             </w:r>
@@ -90,7 +85,7 @@
         </w:tc>
         <w:tc>
           <w:tcPr>
-            <w:tcW w:type="dxa" w:w="6192"/>
+            <w:tcW w:type="dxa" w:w="6480"/>
             <w:shd w:fill="FAFAFA"/>
             <w:tcMar>
               <w:top w:w="80" w:type="dxa"/>
@@ -100,16 +95,60 @@
             </w:tcMar>
           </w:tcPr>
           <w:p>
-            <w:pPr>
-              <w:spacing w:before="40" w:after="40"/>
-            </w:pPr>
             <w:r>
               <w:rPr>
                 <w:rFonts w:ascii="Arial" w:hAnsi="Arial"/>
-                <w:color w:val="212121"/>
-                <w:sz w:val="19"/>
+                <w:color w:val="263238"/>
+                <w:sz w:val="18"/>
               </w:rPr>
-              <w:t>Sistema Integral de Siembras Offline-First (Móvil Flutter + Backend FastAPI)</w:t>
+              <w:t>Sistema Integral de Siembras Offline-First (Móvil Flutter + Backend FastAPI + MS Access)</w:t>
+            </w:r>
+          </w:p>
+        </w:tc>
+      </w:tr>
+      <w:tr>
+        <w:tc>
+          <w:tcPr>
+            <w:tcW w:type="dxa" w:w="3168"/>
+            <w:shd w:fill="F1F8E9"/>
+            <w:tcMar>
+              <w:top w:w="80" w:type="dxa"/>
+              <w:bottom w:w="80" w:type="dxa"/>
+              <w:left w:w="120" w:type="dxa"/>
+              <w:right w:w="120" w:type="dxa"/>
+            </w:tcMar>
+          </w:tcPr>
+          <w:p>
+            <w:r>
+              <w:rPr>
+                <w:rFonts w:ascii="Arial" w:hAnsi="Arial"/>
+                <w:b/>
+                <w:color w:val="1B5E20"/>
+                <w:sz w:val="18"/>
+              </w:rPr>
+              <w:t>Versión Evaluada</w:t>
+            </w:r>
+          </w:p>
+        </w:tc>
+        <w:tc>
+          <w:tcPr>
+            <w:tcW w:type="dxa" w:w="6480"/>
+            <w:shd w:fill="FFFFFF"/>
+            <w:tcMar>
+              <w:top w:w="80" w:type="dxa"/>
+              <w:bottom w:w="80" w:type="dxa"/>
+              <w:left w:w="120" w:type="dxa"/>
+              <w:right w:w="120" w:type="dxa"/>
+            </w:tcMar>
+          </w:tcPr>
+          <w:p>
+            <w:r>
+              <w:rPr>
+                <w:rFonts w:ascii="Arial" w:hAnsi="Arial"/>
+                <w:color w:val="263238"/>
+                <w:sz w:val="18"/>
+              </w:rPr>
+              <w:t>Versión 1.1.0 — Compilación de Producción Android + Suite Backend (Octubre 2026)</w:t>
             </w:r>
           </w:p>
         </w:tc>
@@ -127,23 +166,20 @@
             </w:tcMar>
           </w:tcPr>
           <w:p>
-            <w:pPr>
-              <w:spacing w:before="40" w:after="40"/>
-            </w:pPr>
             <w:r>
               <w:rPr>
                 <w:rFonts w:ascii="Arial" w:hAnsi="Arial"/>
                 <w:b/>
                 <w:color w:val="1B5E20"/>
-                <w:sz w:val="19"/>
+                <w:sz w:val="18"/>
               </w:rPr>
-              <w:t>Versión Evaluada</w:t>
+              <w:t>Ingeniero / Desarrollador</w:t>
             </w:r>
           </w:p>
         </w:tc>
         <w:tc>
           <w:tcPr>
-            <w:tcW w:type="dxa" w:w="6192"/>
+            <w:tcW w:type="dxa" w:w="6480"/>
             <w:shd w:fill="FAFAFA"/>
             <w:tcMar>
               <w:top w:w="80" w:type="dxa"/>
@@ -153,67 +189,11 @@
             </w:tcMar>
           </w:tcPr>
           <w:p>
-            <w:pPr>
-              <w:spacing w:before="40" w:after="40"/>
-            </w:pPr>
             <w:r>
               <w:rPr>
                 <w:rFonts w:ascii="Arial" w:hAnsi="Arial"/>
-                <w:color w:val="212121"/>
-                <w:sz w:val="19"/>
-              </w:rPr>
-              <w:t>Versión 1.1.0 — Compilación de Producción Android (Octubre 2026)</w:t>
-            </w:r>
-          </w:p>
-        </w:tc>
-      </w:tr>
-      <w:tr>
-        <w:tc>
-          <w:tcPr>
-            <w:tcW w:type="dxa" w:w="3168"/>
-            <w:shd w:fill="E8F5E9"/>
-            <w:tcMar>
-              <w:top w:w="80" w:type="dxa"/>
-              <w:bottom w:w="80" w:type="dxa"/>
-              <w:left w:w="120" w:type="dxa"/>
-              <w:right w:w="120" w:type="dxa"/>
-            </w:tcMar>
-          </w:tcPr>
-          <w:p>
-            <w:pPr>
-              <w:spacing w:before="40" w:after="40"/>
-            </w:pPr>
-            <w:r>
-              <w:rPr>
-                <w:rFonts w:ascii="Arial" w:hAnsi="Arial"/>
-                <w:b/>
-                <w:color w:val="1B5E20"/>
-                <w:sz w:val="19"/>
-              </w:rPr>
-              <w:t>Ingeniero / Desarrollador</w:t>
-            </w:r>
-          </w:p>
-        </w:tc>
-        <w:tc>
-          <w:tcPr>
-            <w:tcW w:type="dxa" w:w="6192"/>
-            <w:shd w:fill="FAFAFA"/>
-            <w:tcMar>
-              <w:top w:w="80" w:type="dxa"/>
-              <w:bottom w:w="80" w:type="dxa"/>
-              <w:left w:w="120" w:type="dxa"/>
-              <w:right w:w="120" w:type="dxa"/>
-            </w:tcMar>
-          </w:tcPr>
-          <w:p>
-            <w:pPr>
-              <w:spacing w:before="40" w:after="40"/>
-            </w:pPr>
-            <w:r>
-              <w:rPr>
-                <w:rFonts w:ascii="Arial" w:hAnsi="Arial"/>
-                <w:color w:val="212121"/>
-                <w:sz w:val="19"/>
+                <w:color w:val="263238"/>
+                <w:sz w:val="18"/>
               </w:rPr>
               <w:t>Fernan Julián Pérez Gutiérrez (@FernanJPG1)</w:t>
             </w:r>
@@ -224,7 +204,7 @@
         <w:tc>
           <w:tcPr>
             <w:tcW w:type="dxa" w:w="3168"/>
-            <w:shd w:fill="E8F5E9"/>
+            <w:shd w:fill="F1F8E9"/>
             <w:tcMar>
               <w:top w:w="80" w:type="dxa"/>
               <w:bottom w:w="80" w:type="dxa"/>
@@ -233,15 +213,12 @@
             </w:tcMar>
           </w:tcPr>
           <w:p>
-            <w:pPr>
-              <w:spacing w:before="40" w:after="40"/>
-            </w:pPr>
             <w:r>
               <w:rPr>
                 <w:rFonts w:ascii="Arial" w:hAnsi="Arial"/>
                 <w:b/>
                 <w:color w:val="1B5E20"/>
-                <w:sz w:val="19"/>
+                <w:sz w:val="18"/>
               </w:rPr>
               <w:t>Organización Patrocinadora</w:t>
             </w:r>
@@ -249,8 +226,8 @@
         </w:tc>
         <w:tc>
           <w:tcPr>
-            <w:tcW w:type="dxa" w:w="6192"/>
-            <w:shd w:fill="FAFAFA"/>
+            <w:tcW w:type="dxa" w:w="6480"/>
+            <w:shd w:fill="FFFFFF"/>
             <w:tcMar>
               <w:top w:w="80" w:type="dxa"/>
               <w:bottom w:w="80" w:type="dxa"/>
@@ -259,14 +236,11 @@
             </w:tcMar>
           </w:tcPr>
           <w:p>
-            <w:pPr>
-              <w:spacing w:before="40" w:after="40"/>
-            </w:pPr>
             <w:r>
               <w:rPr>
                 <w:rFonts w:ascii="Arial" w:hAnsi="Arial"/>
-                <w:color w:val="212121"/>
-                <w:sz w:val="19"/>
+                <w:color w:val="263238"/>
+                <w:sz w:val="18"/>
               </w:rPr>
               <w:t>Buenavista Flowers — Operaciones Agronómicas &amp; Exportación</w:t>
             </w:r>
@@ -286,23 +260,20 @@
             </w:tcMar>
           </w:tcPr>
           <w:p>
-            <w:pPr>
-              <w:spacing w:before="40" w:after="40"/>
-            </w:pPr>
             <w:r>
               <w:rPr>
                 <w:rFonts w:ascii="Arial" w:hAnsi="Arial"/>
                 <w:b/>
                 <w:color w:val="1B5E20"/>
-                <w:sz w:val="19"/>
+                <w:sz w:val="18"/>
               </w:rPr>
-              <w:t>Propósito del Documento</w:t>
+              <w:t>Componentes Analizados</w:t>
             </w:r>
           </w:p>
         </w:tc>
         <w:tc>
           <w:tcPr>
-            <w:tcW w:type="dxa" w:w="6192"/>
+            <w:tcW w:type="dxa" w:w="6480"/>
             <w:shd w:fill="FAFAFA"/>
             <w:tcMar>
               <w:top w:w="80" w:type="dxa"/>
@@ -312,14 +283,58 @@
             </w:tcMar>
           </w:tcPr>
           <w:p>
-            <w:pPr>
-              <w:spacing w:before="40" w:after="40"/>
-            </w:pPr>
             <w:r>
               <w:rPr>
                 <w:rFonts w:ascii="Arial" w:hAnsi="Arial"/>
-                <w:color w:val="212121"/>
-                <w:sz w:val="19"/>
+                <w:color w:val="263238"/>
+                <w:sz w:val="18"/>
+              </w:rPr>
+              <w:t>División Bilateral, Modo Mixto, Áreas de Propagación, Motor Rendimiento, Inmutabilidad 48h, PDF Gamificado y Servidor Backend</w:t>
+            </w:r>
+          </w:p>
+        </w:tc>
+      </w:tr>
+      <w:tr>
+        <w:tc>
+          <w:tcPr>
+            <w:tcW w:type="dxa" w:w="3168"/>
+            <w:shd w:fill="F1F8E9"/>
+            <w:tcMar>
+              <w:top w:w="80" w:type="dxa"/>
+              <w:bottom w:w="80" w:type="dxa"/>
+              <w:left w:w="120" w:type="dxa"/>
+              <w:right w:w="120" w:type="dxa"/>
+            </w:tcMar>
+          </w:tcPr>
+          <w:p>
+            <w:r>
+              <w:rPr>
+                <w:rFonts w:ascii="Arial" w:hAnsi="Arial"/>
+                <w:b/>
+                <w:color w:val="1B5E20"/>
+                <w:sz w:val="18"/>
+              </w:rPr>
+              <w:t>Propósito del Documento</w:t>
+            </w:r>
+          </w:p>
+        </w:tc>
+        <w:tc>
+          <w:tcPr>
+            <w:tcW w:type="dxa" w:w="6480"/>
+            <w:shd w:fill="FFFFFF"/>
+            <w:tcMar>
+              <w:top w:w="80" w:type="dxa"/>
+              <w:bottom w:w="80" w:type="dxa"/>
+              <w:left w:w="120" w:type="dxa"/>
+              <w:right w:w="120" w:type="dxa"/>
+            </w:tcMar>
+          </w:tcPr>
+          <w:p>
+            <w:r>
+              <w:rPr>
+                <w:rFonts w:ascii="Arial" w:hAnsi="Arial"/>
+                <w:color w:val="263238"/>
+                <w:sz w:val="18"/>
               </w:rPr>
               <w:t>Explicación exhaustiva de componentes: ¿Qué se desarrolló?, ¿Para qué sirve?, ¿Cómo funciona? y ¿Qué pasa si se quita?</w:t>
             </w:r>
@@ -329,18 +344,21 @@
     </w:tbl>
     <w:p>
       <w:pPr>
-        <w:spacing w:after="160"/>
+        <w:spacing w:before="200" w:after="160"/>
       </w:pPr>
     </w:p>
     <w:p>
+      <w:pPr>
+        <w:spacing w:before="120" w:after="120"/>
+      </w:pPr>
       <w:r>
         <w:rPr>
           <w:rFonts w:ascii="Arial" w:hAnsi="Arial"/>
           <w:b/>
           <w:color w:val="1B5E20"/>
-          <w:sz w:val="26"/>
+          <w:sz w:val="25"/>
         </w:rPr>
-        <w:t>ÍNDICE DEL DOCUMENTO</w:t>
+        <w:t>ÍNDICE ESTRUCTURADO DEL DOCUMENTO</w:t>
       </w:r>
     </w:p>
     <w:p>
@@ -351,10 +369,11 @@
       <w:r>
         <w:rPr>
           <w:rFonts w:ascii="Arial" w:hAnsi="Arial"/>
-          <w:color w:val="333333"/>
-          <w:sz w:val="20"/>
+          <w:b w:val="0"/>
+          <w:color w:val="263238"/>
+          <w:sz w:val="19"/>
         </w:rPr>
-        <w:t>1. Módulo de División Bilateral de Camas (Pompón y Cremón)</w:t>
+        <w:t>1. Módulo de División Bilateral de Camas (Pompón 13/12 y Cremón 11/11)</w:t>
       </w:r>
     </w:p>
     <w:p>
@@ -365,8 +384,9 @@
       <w:r>
         <w:rPr>
           <w:rFonts w:ascii="Arial" w:hAnsi="Arial"/>
-          <w:color w:val="333333"/>
-          <w:sz w:val="20"/>
+          <w:b w:val="0"/>
+          <w:color w:val="263238"/>
+          <w:sz w:val="19"/>
         </w:rPr>
         <w:t>2. Módulo de Régimen Transversal y Cambio de Lado ('Pasó al otro lado' / Siembra Mixta)</w:t>
       </w:r>
@@ -379,8 +399,9 @@
       <w:r>
         <w:rPr>
           <w:rFonts w:ascii="Arial" w:hAnsi="Arial"/>
-          <w:color w:val="333333"/>
-          <w:sz w:val="20"/>
+          <w:b w:val="0"/>
+          <w:color w:val="263238"/>
+          <w:sz w:val="19"/>
         </w:rPr>
         <w:t>3. Módulo de Desacoplamiento de Sembrador en Áreas de Propagación (Plantas Madre, Bancos y Núcleos)</w:t>
       </w:r>
@@ -393,10 +414,11 @@
       <w:r>
         <w:rPr>
           <w:rFonts w:ascii="Arial" w:hAnsi="Arial"/>
-          <w:color w:val="333333"/>
-          <w:sz w:val="20"/>
+          <w:b w:val="0"/>
+          <w:color w:val="263238"/>
+          <w:sz w:val="19"/>
         </w:rPr>
-        <w:t>4. Módulo de Exclusión Analítica de Propagación en el Motor de Rendimiento</w:t>
+        <w:t>4. Módulo de Exclusión Analítica de Propagación en el Motor de Rendimiento y Reportes</w:t>
       </w:r>
     </w:p>
     <w:p>
@@ -407,10 +429,11 @@
       <w:r>
         <w:rPr>
           <w:rFonts w:ascii="Arial" w:hAnsi="Arial"/>
-          <w:color w:val="333333"/>
-          <w:sz w:val="20"/>
+          <w:b w:val="0"/>
+          <w:color w:val="263238"/>
+          <w:sz w:val="19"/>
         </w:rPr>
-        <w:t>5. Módulo de Política de Inmutabilidad Temporal y Bloqueo Transaccional a 2 Días</w:t>
+        <w:t>5. Módulo de Política de Inmutabilidad Temporal y Bloqueo Transaccional a 2 Días (48 Horas)</w:t>
       </w:r>
     </w:p>
     <w:p>
@@ -421,8 +444,9 @@
       <w:r>
         <w:rPr>
           <w:rFonts w:ascii="Arial" w:hAnsi="Arial"/>
-          <w:color w:val="333333"/>
-          <w:sz w:val="20"/>
+          <w:b w:val="0"/>
+          <w:color w:val="263238"/>
+          <w:sz w:val="19"/>
         </w:rPr>
         <w:t>6. Módulo de Gamificación, Podio de Medallas y Reportes Ejecutivos en PDF</w:t>
       </w:r>
@@ -435,10 +459,11 @@
       <w:r>
         <w:rPr>
           <w:rFonts w:ascii="Arial" w:hAnsi="Arial"/>
-          <w:color w:val="333333"/>
-          <w:sz w:val="20"/>
+          <w:b/>
+          <w:color w:val="263238"/>
+          <w:sz w:val="19"/>
         </w:rPr>
-        <w:t>7. Matriz Comparativa de Riesgo e Impacto Cruzado: ¿Qué Pasa si se Quita Cada Módulo?</w:t>
+        <w:t>7. Módulo del Servidor Backend e Iniciar Backend (iniciar_backend.bat, FastAPI, Uvicorn, Detección de IP y Sincronización en Access)</w:t>
       </w:r>
     </w:p>
     <w:p>
@@ -449,24 +474,44 @@
       <w:r>
         <w:rPr>
           <w:rFonts w:ascii="Arial" w:hAnsi="Arial"/>
-          <w:color w:val="333333"/>
-          <w:sz w:val="20"/>
+          <w:b/>
+          <w:color w:val="263238"/>
+          <w:sz w:val="19"/>
         </w:rPr>
-        <w:t>8. Conclusiones y Dictamen de Calidad de Software</w:t>
+        <w:t>8. Matriz Comparativa de Riesgo e Impacto Cruzado: ¿Qué Pasa si se Quita Cada Módulo?</w:t>
       </w:r>
     </w:p>
     <w:p>
+      <w:pPr>
+        <w:pStyle w:val="ListBullet"/>
+        <w:spacing w:before="20" w:after="40"/>
+      </w:pPr>
       <w:r>
-        <w:br w:type="page"/>
+        <w:rPr>
+          <w:rFonts w:ascii="Arial" w:hAnsi="Arial"/>
+          <w:b w:val="0"/>
+          <w:color w:val="263238"/>
+          <w:sz w:val="19"/>
+        </w:rPr>
+        <w:t>9. Conclusiones, Arquitectura Integral y Dictamen de Calidad de Software</w:t>
       </w:r>
     </w:p>
     <w:p>
+      <w:pPr>
+        <w:spacing w:before="160" w:after="160"/>
+      </w:pPr>
+    </w:p>
+    <w:p>
+      <w:pPr>
+        <w:keepNext/>
+        <w:spacing w:before="280" w:after="120"/>
+      </w:pPr>
       <w:r>
         <w:rPr>
           <w:rFonts w:ascii="Arial" w:hAnsi="Arial"/>
           <w:b/>
           <w:color w:val="1B5E20"/>
-          <w:sz w:val="30"/>
+          <w:sz w:val="28"/>
         </w:rPr>
         <w:t>1. Módulo de División Bilateral de Camas (Pompón y Cremón)</w:t>
       </w:r>
@@ -507,17 +552,22 @@
               <w:rPr>
                 <w:rFonts w:ascii="Arial" w:hAnsi="Arial"/>
                 <w:b/>
-                <w:color w:val="1B5E20"/>
-                <w:sz w:val="22"/>
+                <w:color w:val="2E7D32"/>
+                <w:sz w:val="21"/>
               </w:rPr>
               <w:t>🌱 Principio Agronómico de la Cama Dividida</w:t>
               <w:br/>
             </w:r>
+          </w:p>
+          <w:p>
+            <w:pPr>
+              <w:spacing w:before="0" w:after="40" w:line="276" w:lineRule="auto"/>
+            </w:pPr>
             <w:r>
               <w:rPr>
                 <w:rFonts w:ascii="Arial" w:hAnsi="Arial"/>
-                <w:color w:val="212121"/>
-                <w:sz w:val="20"/>
+                <w:color w:val="333333"/>
+                <w:sz w:val="19"/>
               </w:rPr>
               <w:t>En los invernaderos comerciales de Buenavista Flowers, una cama de flores estándar no es sembrada por una sola persona avanzando sobre toda la superficie. Físicamente se siembra por cuadrillas de dos sembradores ubicados en costados opuestos (Lado A y Lado B). Debido a la disposición de las mallas y las líneas de goteros, la densidad física por línea varía entre cada lado.</w:t>
             </w:r>
@@ -531,18 +581,30 @@
       </w:pPr>
     </w:p>
     <w:p>
+      <w:pPr>
+        <w:keepNext/>
+        <w:spacing w:before="160" w:after="60"/>
+      </w:pPr>
       <w:r>
         <w:rPr>
           <w:rFonts w:ascii="Arial" w:hAnsi="Arial"/>
           <w:b/>
-          <w:color w:val="2E7D32"/>
-          <w:sz w:val="24"/>
+          <w:color w:val="558B2F"/>
+          <w:sz w:val="22"/>
         </w:rPr>
         <w:t>1.1 ¿Qué se desarrolló?</w:t>
       </w:r>
     </w:p>
     <w:p>
+      <w:pPr>
+        <w:spacing w:before="40" w:after="100" w:line="276" w:lineRule="auto"/>
+      </w:pPr>
       <w:r>
+        <w:rPr>
+          <w:rFonts w:ascii="Arial" w:hAnsi="Arial"/>
+          <w:color w:val="263238"/>
+          <w:sz w:val="19"/>
+        </w:rPr>
         <w:t>Se implementó una arquitectura de partición bilateral en el formulario de captura móvil (lib/screens/form_siembra_pompon_screen.dart) que reconoce la geometría de la cama y permite registrar individualmente la labor de cada sembrador según el lado físico asignado:</w:t>
         <w:br/>
         <w:t>• Para Pompón: Total de 25 esquejes por línea (Lado A = 13 esquejes/línea | Lado B = 12 esquejes/línea).</w:t>
@@ -555,40 +617,64 @@
       </w:r>
     </w:p>
     <w:p>
+      <w:pPr>
+        <w:keepNext/>
+        <w:spacing w:before="160" w:after="60"/>
+      </w:pPr>
       <w:r>
         <w:rPr>
           <w:rFonts w:ascii="Arial" w:hAnsi="Arial"/>
           <w:b/>
-          <w:color w:val="2E7D32"/>
-          <w:sz w:val="24"/>
+          <w:color w:val="558B2F"/>
+          <w:sz w:val="22"/>
         </w:rPr>
         <w:t>1.2 ¿Para qué sirve?</w:t>
       </w:r>
     </w:p>
     <w:p>
+      <w:pPr>
+        <w:spacing w:before="40" w:after="100" w:line="276" w:lineRule="auto"/>
+      </w:pPr>
       <w:r>
+        <w:rPr>
+          <w:rFonts w:ascii="Arial" w:hAnsi="Arial"/>
+          <w:color w:val="263238"/>
+          <w:sz w:val="19"/>
+        </w:rPr>
         <w:t>Sirve para eliminar las discrepancias de inventario vegetal y saldar con absoluta equidad la nómina y el rendimiento de los trabajadores:</w:t>
         <w:br/>
-        <w:t>• Elimina el error tradicional donde se promediaban 25 esquejes entre dos operarios (12.5 ficticio) generando descuadres.</w:t>
+        <w:t>• Elimina el error tradicional donde se promediaban 25 esquejes entre dos operarios (12.5 ficticio) generando descuadres contables.</w:t>
         <w:br/>
-        <w:t>• Reconoce que quien sembró el Lado A en pompón plantó 13 esquejes por cada línea, mientras que quien sembró el Lado B plantó 12. En una cama de 130 líneas, esto representa 1.690 esquejes en el Lado A contra 1.560 en el Lado B (una diferencia real de 130 plantas).</w:t>
+        <w:t>• Reconoce que quien sembró el Lado A en pompón plantó 13 esquejes por cada línea, mientras que quien sembró el Lado B plantó 12. En una cama de 130 líneas, esto representa 1.690 esquejes en el Lado A contra 1.560 en el Lado B (una diferencia real de 130 plantas por cama).</w:t>
         <w:br/>
         <w:t>• Permite registrar el avance individual de cada sembrador inmediatamente al terminar su costado sin esperar a que el compañero termine.</w:t>
       </w:r>
     </w:p>
     <w:p>
+      <w:pPr>
+        <w:keepNext/>
+        <w:spacing w:before="160" w:after="60"/>
+      </w:pPr>
       <w:r>
         <w:rPr>
           <w:rFonts w:ascii="Arial" w:hAnsi="Arial"/>
           <w:b/>
-          <w:color w:val="2E7D32"/>
-          <w:sz w:val="24"/>
+          <w:color w:val="558B2F"/>
+          <w:sz w:val="22"/>
         </w:rPr>
         <w:t>1.3 ¿Cómo funciona?</w:t>
       </w:r>
     </w:p>
     <w:p>
+      <w:pPr>
+        <w:spacing w:before="40" w:after="100" w:line="276" w:lineRule="auto"/>
+      </w:pPr>
       <w:r>
+        <w:rPr>
+          <w:rFonts w:ascii="Arial" w:hAnsi="Arial"/>
+          <w:color w:val="263238"/>
+          <w:sz w:val="19"/>
+        </w:rPr>
         <w:t>1. Detección Inteligente del Cultivo: El getter _tieneDivisionDosLados identifica si el cultivo actual es Pompón o Cremón (tanto por nombre de cultivo como por familia botánica en el catálogo).</w:t>
         <w:br/>
         <w:t>2. Asignación de Parámetros: Los getters _densidadLadoA y _densidadLadoB devuelven 13 y 12 para Pompón, o 11 y 11 para Cremón.</w:t>
@@ -601,16 +687,20 @@
         <w:br/>
         <w:t xml:space="preserve">   - Si es 'AMBOS': Tallos = Líneas × (_densidadLadoA + _densidadLadoB) [25 o 22].</w:t>
         <w:br/>
-        <w:t>4. Persistencia en Base de Datos: Al guardar, se inyecta en el campo observaciones la etiqueta formal 'LADO A (13 esq/lín)' o 'LADO B (12 esq/lín)', asegurando trazabilidad plena en SQLite y Microsoft Access.</w:t>
+        <w:t>4. Persistencia en Base de Datos: Al guardar, se inyecta en el campo observaciones la etiqueta formal 'LADO A (13 esq/lín)' o 'LADO B (12 esq/lín)', asegurando trazabilidad plena en SQLite local y en las tablas de Microsoft Access al sincronizar.</w:t>
       </w:r>
     </w:p>
     <w:p>
+      <w:pPr>
+        <w:keepNext/>
+        <w:spacing w:before="160" w:after="60"/>
+      </w:pPr>
       <w:r>
         <w:rPr>
           <w:rFonts w:ascii="Arial" w:hAnsi="Arial"/>
           <w:b/>
-          <w:color w:val="C62828"/>
-          <w:sz w:val="24"/>
+          <w:color w:val="558B2F"/>
+          <w:sz w:val="22"/>
         </w:rPr>
         <w:t>1.4 ¿Qué pasa si se quita?</w:t>
       </w:r>
@@ -651,23 +741,28 @@
               <w:rPr>
                 <w:rFonts w:ascii="Arial" w:hAnsi="Arial"/>
                 <w:b/>
-                <w:color w:val="1B5E20"/>
-                <w:sz w:val="22"/>
+                <w:color w:val="C62828"/>
+                <w:sz w:val="21"/>
               </w:rPr>
               <w:t>⚠️ Consecuencias Críticas si se Elimina la División Bilateral</w:t>
               <w:br/>
             </w:r>
+          </w:p>
+          <w:p>
+            <w:pPr>
+              <w:spacing w:before="0" w:after="40" w:line="276" w:lineRule="auto"/>
+            </w:pPr>
             <w:r>
               <w:rPr>
                 <w:rFonts w:ascii="Arial" w:hAnsi="Arial"/>
-                <w:color w:val="212121"/>
-                <w:sz w:val="20"/>
+                <w:color w:val="333333"/>
+                <w:sz w:val="19"/>
               </w:rPr>
               <w:t>• Descuadre Sistemático de Inventario: Se generarían diferencias de cientos de miles de esquejes al mes entre lo reportado en las planillas y el conteo físico en campo.</w:t>
               <w:br/>
-              <w:t>• Injusticia en la Nómina Laboral: El sembrador del Lado A (que siembra 13 esquejes/línea) recibiría la misma remuneración o rendimiento que quien siembra 12 en el Lado B, provocando quejas y reclamos justificados de los trabajadores.</w:t>
+              <w:t>• Injusticia en la Nómina Laboral: El sembrador del Lado A (que siembra 13 esquejes/línea) recibiría la misma remuneración que quien siembra 12 en el Lado B, provocando quejas y reclamos de los trabajadores.</w:t>
               <w:br/>
-              <w:t>• Imposibilidad de Siembra Asíncrona: Forzaría a que ambos sembradores tengan que registrar juntos la cama completa obligatoriamente, perdiéndose la captura en tiempo real cuando uno se va a almorzar, se enferma o es reubicado a otro bloque.</w:t>
+              <w:t>• Imposibilidad de Siembra Asíncrona: Forzaría a que ambos sembradores tengan que registrar juntos la cama completa obligatoriamente, perdiéndose la captura en tiempo real cuando uno se va a almorzar, se enferma o es reubicado.</w:t>
             </w:r>
           </w:p>
         </w:tc>
@@ -680,65 +775,102 @@
     </w:p>
     <w:p>
       <w:pPr>
-        <w:spacing w:before="280"/>
+        <w:keepNext/>
+        <w:spacing w:before="280" w:after="120"/>
       </w:pPr>
       <w:r>
         <w:rPr>
           <w:rFonts w:ascii="Arial" w:hAnsi="Arial"/>
           <w:b/>
           <w:color w:val="1B5E20"/>
-          <w:sz w:val="30"/>
+          <w:sz w:val="28"/>
         </w:rPr>
-        <w:t>2. Módulo de Régimen Transversal y Cambio de Lado ('Pasó al otro lado')</w:t>
+        <w:t>2. Módulo de Régimen Transversal y Cambio de Lado ('Pasó al otro lado' / Siembra Mixta)</w:t>
       </w:r>
     </w:p>
     <w:p>
+      <w:pPr>
+        <w:keepNext/>
+        <w:spacing w:before="160" w:after="60"/>
+      </w:pPr>
       <w:r>
         <w:rPr>
           <w:rFonts w:ascii="Arial" w:hAnsi="Arial"/>
           <w:b/>
-          <w:color w:val="2E7D32"/>
-          <w:sz w:val="24"/>
+          <w:color w:val="558B2F"/>
+          <w:sz w:val="22"/>
         </w:rPr>
         <w:t>2.1 ¿Qué se desarrolló?</w:t>
       </w:r>
     </w:p>
     <w:p>
+      <w:pPr>
+        <w:spacing w:before="40" w:after="100" w:line="276" w:lineRule="auto"/>
+      </w:pPr>
       <w:r>
+        <w:rPr>
+          <w:rFonts w:ascii="Arial" w:hAnsi="Arial"/>
+          <w:color w:val="263238"/>
+          <w:sz w:val="19"/>
+        </w:rPr>
         <w:t>Se diseñó una funcionalidad de siembra mixta transversal activada mediante el botón 'Pasó al otro lado'. Cuando este modo se activa, la interfaz transforma el campo único de líneas en dos entradas numéricas independientes: 'Líneas Lado A' y 'Líneas Lado B', con controladores separados (_lineasLadoAController y _lineasLadoBController) y un banner de cálculo dinámico ponderado.</w:t>
       </w:r>
     </w:p>
     <w:p>
+      <w:pPr>
+        <w:keepNext/>
+        <w:spacing w:before="160" w:after="60"/>
+      </w:pPr>
       <w:r>
         <w:rPr>
           <w:rFonts w:ascii="Arial" w:hAnsi="Arial"/>
           <w:b/>
-          <w:color w:val="2E7D32"/>
-          <w:sz w:val="24"/>
+          <w:color w:val="558B2F"/>
+          <w:sz w:val="22"/>
         </w:rPr>
         <w:t>2.2 ¿Para qué sirve?</w:t>
       </w:r>
     </w:p>
     <w:p>
+      <w:pPr>
+        <w:spacing w:before="40" w:after="100" w:line="276" w:lineRule="auto"/>
+      </w:pPr>
       <w:r>
+        <w:rPr>
+          <w:rFonts w:ascii="Arial" w:hAnsi="Arial"/>
+          <w:color w:val="263238"/>
+          <w:sz w:val="19"/>
+        </w:rPr>
         <w:t>Resuelve un escenario cotidiano en los invernaderos: los sembradores no avanzan a la misma velocidad. Si el sembrador del Lado A es más rápido y termina sus 130 líneas mientras a su compañero en el Lado B aún le faltan 30 líneas, el trabajador más rápido no se queda de brazos cruzados: se cruza al Lado B y siembra esas 30 líneas faltantes para que la cama quede lista.</w:t>
         <w:br/>
         <w:t>Esta función permite reconocer y liquidar exactamente las líneas sembradas en su lado original (a 13 o 11 esq/l) más las líneas sembradas en el lado opuesto (a 12 o 11 esq/l) en un solo registro transparente y auditado.</w:t>
       </w:r>
     </w:p>
     <w:p>
+      <w:pPr>
+        <w:keepNext/>
+        <w:spacing w:before="160" w:after="60"/>
+      </w:pPr>
       <w:r>
         <w:rPr>
           <w:rFonts w:ascii="Arial" w:hAnsi="Arial"/>
           <w:b/>
-          <w:color w:val="2E7D32"/>
-          <w:sz w:val="24"/>
+          <w:color w:val="558B2F"/>
+          <w:sz w:val="22"/>
         </w:rPr>
         <w:t>2.3 ¿Cómo funciona?</w:t>
       </w:r>
     </w:p>
     <w:p>
+      <w:pPr>
+        <w:spacing w:before="40" w:after="100" w:line="276" w:lineRule="auto"/>
+      </w:pPr>
       <w:r>
+        <w:rPr>
+          <w:rFonts w:ascii="Arial" w:hAnsi="Arial"/>
+          <w:color w:val="263238"/>
+          <w:sz w:val="19"/>
+        </w:rPr>
         <w:t>1. Conmutación de Modo: Al presionar [Pasó al otro lado], el estado _ladoSeleccionado pasa a 'MIXTO'.</w:t>
         <w:br/>
         <w:t>2. Transformación de UI: Se oculta el campo simple de líneas y se renderiza un Row con dos TextFormFields: [Lado A (13 esq/l)] y [Lado B (12 esq/l)].</w:t>
@@ -755,12 +887,16 @@
       </w:r>
     </w:p>
     <w:p>
+      <w:pPr>
+        <w:keepNext/>
+        <w:spacing w:before="160" w:after="60"/>
+      </w:pPr>
       <w:r>
         <w:rPr>
           <w:rFonts w:ascii="Arial" w:hAnsi="Arial"/>
           <w:b/>
-          <w:color w:val="C62828"/>
-          <w:sz w:val="24"/>
+          <w:color w:val="558B2F"/>
+          <w:sz w:val="22"/>
         </w:rPr>
         <w:t>2.4 ¿Qué pasa si se quita?</w:t>
       </w:r>
@@ -801,17 +937,22 @@
               <w:rPr>
                 <w:rFonts w:ascii="Arial" w:hAnsi="Arial"/>
                 <w:b/>
-                <w:color w:val="1B5E20"/>
-                <w:sz w:val="22"/>
+                <w:color w:val="C62828"/>
+                <w:sz w:val="21"/>
               </w:rPr>
               <w:t>⚠️ Consecuencias Críticas si se Elimina el Modo Mixto</w:t>
               <w:br/>
             </w:r>
+          </w:p>
+          <w:p>
+            <w:pPr>
+              <w:spacing w:before="0" w:after="40" w:line="276" w:lineRule="auto"/>
+            </w:pPr>
             <w:r>
               <w:rPr>
                 <w:rFonts w:ascii="Arial" w:hAnsi="Arial"/>
-                <w:color w:val="212121"/>
-                <w:sz w:val="20"/>
+                <w:color w:val="333333"/>
+                <w:sz w:val="19"/>
               </w:rPr>
               <w:t>• Obligación de Falsear Datos: Los supervisores tendrían que obligar al sembrador a 'inventar' líneas en un solo lado o hacer cálculos manuales con lápiz y papel para cuadrar el número de esquejes.</w:t>
               <w:br/>
@@ -830,31 +971,44 @@
     </w:p>
     <w:p>
       <w:pPr>
-        <w:spacing w:before="280"/>
+        <w:keepNext/>
+        <w:spacing w:before="280" w:after="120"/>
       </w:pPr>
       <w:r>
         <w:rPr>
           <w:rFonts w:ascii="Arial" w:hAnsi="Arial"/>
           <w:b/>
           <w:color w:val="1B5E20"/>
-          <w:sz w:val="30"/>
+          <w:sz w:val="28"/>
         </w:rPr>
-        <w:t>3. Módulo de Desacoplamiento de Sembrador en Áreas de Propagación (Planta Madre, Bancos y Núcleos)</w:t>
+        <w:t>3. Módulo de Desacoplamiento de Sembrador en Áreas de Propagación (Plantas Madre, Bancos y Núcleos)</w:t>
       </w:r>
     </w:p>
     <w:p>
+      <w:pPr>
+        <w:keepNext/>
+        <w:spacing w:before="160" w:after="60"/>
+      </w:pPr>
       <w:r>
         <w:rPr>
           <w:rFonts w:ascii="Arial" w:hAnsi="Arial"/>
           <w:b/>
-          <w:color w:val="2E7D32"/>
-          <w:sz w:val="24"/>
+          <w:color w:val="558B2F"/>
+          <w:sz w:val="22"/>
         </w:rPr>
         <w:t>3.1 ¿Qué se desarrolló?</w:t>
       </w:r>
     </w:p>
     <w:p>
+      <w:pPr>
+        <w:spacing w:before="40" w:after="100" w:line="276" w:lineRule="auto"/>
+      </w:pPr>
       <w:r>
+        <w:rPr>
+          <w:rFonts w:ascii="Arial" w:hAnsi="Arial"/>
+          <w:color w:val="263238"/>
+          <w:sz w:val="19"/>
+        </w:rPr>
         <w:t>Se implementó el desacoplamiento completo del componente de selección de operario en las áreas de propagación vegetal:</w:t>
         <w:br/>
         <w:t>• Detección automática: El getter _esPlantaMadreOBancoONucleo identifica si el formulario corresponde a Planta Madre, Bancos o Núcleos.</w:t>
@@ -867,18 +1021,30 @@
       </w:r>
     </w:p>
     <w:p>
+      <w:pPr>
+        <w:keepNext/>
+        <w:spacing w:before="160" w:after="60"/>
+      </w:pPr>
       <w:r>
         <w:rPr>
           <w:rFonts w:ascii="Arial" w:hAnsi="Arial"/>
           <w:b/>
-          <w:color w:val="2E7D32"/>
-          <w:sz w:val="24"/>
+          <w:color w:val="558B2F"/>
+          <w:sz w:val="22"/>
         </w:rPr>
         <w:t>3.2 ¿Para qué sirve?</w:t>
       </w:r>
     </w:p>
     <w:p>
+      <w:pPr>
+        <w:spacing w:before="40" w:after="100" w:line="276" w:lineRule="auto"/>
+      </w:pPr>
       <w:r>
+        <w:rPr>
+          <w:rFonts w:ascii="Arial" w:hAnsi="Arial"/>
+          <w:color w:val="263238"/>
+          <w:sz w:val="19"/>
+        </w:rPr>
         <w:t>Las plantas madre, los bancos de enraizamiento y los núcleos élite son áreas técnicas de multiplicación y custodia genética, no son camas de siembra comercial orientadas a corte de exportación:</w:t>
         <w:br/>
         <w:t>• En estas áreas trabajan cuadrillas técnicas rotativas, injertadores o fitopatólogos encargados del mantenimiento del banco de germoplasma.</w:t>
@@ -887,18 +1053,30 @@
       </w:r>
     </w:p>
     <w:p>
+      <w:pPr>
+        <w:keepNext/>
+        <w:spacing w:before="160" w:after="60"/>
+      </w:pPr>
       <w:r>
         <w:rPr>
           <w:rFonts w:ascii="Arial" w:hAnsi="Arial"/>
           <w:b/>
-          <w:color w:val="2E7D32"/>
-          <w:sz w:val="24"/>
+          <w:color w:val="558B2F"/>
+          <w:sz w:val="22"/>
         </w:rPr>
         <w:t>3.3 ¿Cómo funciona?</w:t>
       </w:r>
     </w:p>
     <w:p>
+      <w:pPr>
+        <w:spacing w:before="40" w:after="100" w:line="276" w:lineRule="auto"/>
+      </w:pPr>
       <w:r>
+        <w:rPr>
+          <w:rFonts w:ascii="Arial" w:hAnsi="Arial"/>
+          <w:color w:val="263238"/>
+          <w:sz w:val="19"/>
+        </w:rPr>
         <w:t>1. En lib/screens/form_siembra_pompon_screen.dart:</w:t>
         <w:br/>
         <w:t xml:space="preserve">   Widget _buildCampoOperario() {</w:t>
@@ -915,12 +1093,16 @@
       </w:r>
     </w:p>
     <w:p>
+      <w:pPr>
+        <w:keepNext/>
+        <w:spacing w:before="160" w:after="60"/>
+      </w:pPr>
       <w:r>
         <w:rPr>
           <w:rFonts w:ascii="Arial" w:hAnsi="Arial"/>
           <w:b/>
-          <w:color w:val="C62828"/>
-          <w:sz w:val="24"/>
+          <w:color w:val="558B2F"/>
+          <w:sz w:val="22"/>
         </w:rPr>
         <w:t>3.4 ¿Qué pasa si se quita?</w:t>
       </w:r>
@@ -961,17 +1143,22 @@
               <w:rPr>
                 <w:rFonts w:ascii="Arial" w:hAnsi="Arial"/>
                 <w:b/>
-                <w:color w:val="1B5E20"/>
-                <w:sz w:val="22"/>
+                <w:color w:val="C62828"/>
+                <w:sz w:val="21"/>
               </w:rPr>
               <w:t>⚠️ Consecuencias Críticas si se Elimina la Supresión de Sembrador</w:t>
               <w:br/>
             </w:r>
+          </w:p>
+          <w:p>
+            <w:pPr>
+              <w:spacing w:before="0" w:after="40" w:line="276" w:lineRule="auto"/>
+            </w:pPr>
             <w:r>
               <w:rPr>
                 <w:rFonts w:ascii="Arial" w:hAnsi="Arial"/>
-                <w:color w:val="212121"/>
-                <w:sz w:val="20"/>
+                <w:color w:val="333333"/>
+                <w:sz w:val="19"/>
               </w:rPr>
               <w:t>• Bloqueo Innecesario de Captura: La app exigiría obligatoriamente seleccionar un operario, impidiendo registrar labores en bancos y plantas madre a menos que se use un empleado ficticio.</w:t>
               <w:br/>
@@ -990,31 +1177,44 @@
     </w:p>
     <w:p>
       <w:pPr>
-        <w:spacing w:before="280"/>
+        <w:keepNext/>
+        <w:spacing w:before="280" w:after="120"/>
       </w:pPr>
       <w:r>
         <w:rPr>
           <w:rFonts w:ascii="Arial" w:hAnsi="Arial"/>
           <w:b/>
           <w:color w:val="1B5E20"/>
-          <w:sz w:val="30"/>
+          <w:sz w:val="28"/>
         </w:rPr>
         <w:t>4. Módulo de Exclusión Analítica de Propagación en el Motor de Rendimiento</w:t>
       </w:r>
     </w:p>
     <w:p>
+      <w:pPr>
+        <w:keepNext/>
+        <w:spacing w:before="160" w:after="60"/>
+      </w:pPr>
       <w:r>
         <w:rPr>
           <w:rFonts w:ascii="Arial" w:hAnsi="Arial"/>
           <w:b/>
-          <w:color w:val="2E7D32"/>
-          <w:sz w:val="24"/>
+          <w:color w:val="558B2F"/>
+          <w:sz w:val="22"/>
         </w:rPr>
         <w:t>4.1 ¿Qué se desarrolló?</w:t>
       </w:r>
     </w:p>
     <w:p>
+      <w:pPr>
+        <w:spacing w:before="40" w:after="100" w:line="276" w:lineRule="auto"/>
+      </w:pPr>
       <w:r>
+        <w:rPr>
+          <w:rFonts w:ascii="Arial" w:hAnsi="Arial"/>
+          <w:color w:val="263238"/>
+          <w:sz w:val="19"/>
+        </w:rPr>
         <w:t>Se blindó el motor central de analítica de productividad para excluir de raíz cualquier siembra asociada a propagación especial:</w:t>
         <w:br/>
         <w:t>• En lib/models/entidades.dart (método RendimientoOperario.calcular): Se añadieron filtros que descartan registros con operarioId &lt;= 0 o cuyos campos de cultivo, variedad, observaciones o corte contengan 'MADRE', 'BANCO' o 'NÚCLEO'.</w:t>
@@ -1025,18 +1225,30 @@
       </w:r>
     </w:p>
     <w:p>
+      <w:pPr>
+        <w:keepNext/>
+        <w:spacing w:before="160" w:after="60"/>
+      </w:pPr>
       <w:r>
         <w:rPr>
           <w:rFonts w:ascii="Arial" w:hAnsi="Arial"/>
           <w:b/>
-          <w:color w:val="2E7D32"/>
-          <w:sz w:val="24"/>
+          <w:color w:val="558B2F"/>
+          <w:sz w:val="22"/>
         </w:rPr>
         <w:t>4.2 ¿Para qué sirve?</w:t>
       </w:r>
     </w:p>
     <w:p>
+      <w:pPr>
+        <w:spacing w:before="40" w:after="100" w:line="276" w:lineRule="auto"/>
+      </w:pPr>
       <w:r>
+        <w:rPr>
+          <w:rFonts w:ascii="Arial" w:hAnsi="Arial"/>
+          <w:color w:val="263238"/>
+          <w:sz w:val="19"/>
+        </w:rPr>
         <w:t>Sirve para proteger la exactitud de los indicadores clave de desempeño (KPIs) y la equidad de las bonificaciones laborales:</w:t>
         <w:br/>
         <w:t>• En plantas madre o bancos se siembran pocas plantas por cama con un cuidado manual meticuloso y desinfección estricta. Si esto se incluyera en el rendimiento, el promedio de velocidad del trabajador caería estrepitosamente a niveles inaceptables (castigo injusto).</w:t>
@@ -1045,18 +1257,30 @@
       </w:r>
     </w:p>
     <w:p>
+      <w:pPr>
+        <w:keepNext/>
+        <w:spacing w:before="160" w:after="60"/>
+      </w:pPr>
       <w:r>
         <w:rPr>
           <w:rFonts w:ascii="Arial" w:hAnsi="Arial"/>
           <w:b/>
-          <w:color w:val="2E7D32"/>
-          <w:sz w:val="24"/>
+          <w:color w:val="558B2F"/>
+          <w:sz w:val="22"/>
         </w:rPr>
         <w:t>4.3 ¿Cómo funciona?</w:t>
       </w:r>
     </w:p>
     <w:p>
+      <w:pPr>
+        <w:spacing w:before="40" w:after="100" w:line="276" w:lineRule="auto"/>
+      </w:pPr>
       <w:r>
+        <w:rPr>
+          <w:rFonts w:ascii="Arial" w:hAnsi="Arial"/>
+          <w:color w:val="263238"/>
+          <w:sz w:val="19"/>
+        </w:rPr>
         <w:t>El motor algorítmico evalúa cada registro Siembra antes de procesar la métrica:</w:t>
         <w:br/>
         <w:t xml:space="preserve">       bool esAreaEspecial = s.operarioId &lt;= 0 ||</w:t>
@@ -1071,12 +1295,16 @@
       </w:r>
     </w:p>
     <w:p>
+      <w:pPr>
+        <w:keepNext/>
+        <w:spacing w:before="160" w:after="60"/>
+      </w:pPr>
       <w:r>
         <w:rPr>
           <w:rFonts w:ascii="Arial" w:hAnsi="Arial"/>
           <w:b/>
-          <w:color w:val="C62828"/>
-          <w:sz w:val="24"/>
+          <w:color w:val="558B2F"/>
+          <w:sz w:val="22"/>
         </w:rPr>
         <w:t>4.4 ¿Qué pasa si se quita?</w:t>
       </w:r>
@@ -1117,17 +1345,22 @@
               <w:rPr>
                 <w:rFonts w:ascii="Arial" w:hAnsi="Arial"/>
                 <w:b/>
-                <w:color w:val="1B5E20"/>
-                <w:sz w:val="22"/>
+                <w:color w:val="C62828"/>
+                <w:sz w:val="21"/>
               </w:rPr>
               <w:t>⚠️ Consecuencias Críticas si se Elimina la Exclusión de Rendimiento</w:t>
               <w:br/>
             </w:r>
+          </w:p>
+          <w:p>
+            <w:pPr>
+              <w:spacing w:before="0" w:after="40" w:line="276" w:lineRule="auto"/>
+            </w:pPr>
             <w:r>
               <w:rPr>
                 <w:rFonts w:ascii="Arial" w:hAnsi="Arial"/>
-                <w:color w:val="212121"/>
-                <w:sz w:val="20"/>
+                <w:color w:val="333333"/>
+                <w:sz w:val="19"/>
               </w:rPr>
               <w:t>• Rankings Laborales Falsos y Sesgados: Un operario que hizo una labor técnica impecable en bancos aparecería de último en el ranking con una supuesta baja productividad, perdiendo bonificaciones salariales injustamente.</w:t>
               <w:br/>
@@ -1144,31 +1377,44 @@
     </w:p>
     <w:p>
       <w:pPr>
-        <w:spacing w:before="280"/>
+        <w:keepNext/>
+        <w:spacing w:before="280" w:after="120"/>
       </w:pPr>
       <w:r>
         <w:rPr>
           <w:rFonts w:ascii="Arial" w:hAnsi="Arial"/>
           <w:b/>
           <w:color w:val="1B5E20"/>
-          <w:sz w:val="30"/>
+          <w:sz w:val="28"/>
         </w:rPr>
         <w:t>5. Módulo de Política de Inmutabilidad Temporal y Bloqueo Transaccional a 2 Días</w:t>
       </w:r>
     </w:p>
     <w:p>
+      <w:pPr>
+        <w:keepNext/>
+        <w:spacing w:before="160" w:after="60"/>
+      </w:pPr>
       <w:r>
         <w:rPr>
           <w:rFonts w:ascii="Arial" w:hAnsi="Arial"/>
           <w:b/>
-          <w:color w:val="2E7D32"/>
-          <w:sz w:val="24"/>
+          <w:color w:val="558B2F"/>
+          <w:sz w:val="22"/>
         </w:rPr>
         <w:t>5.1 ¿Qué se desarrolló?</w:t>
       </w:r>
     </w:p>
     <w:p>
+      <w:pPr>
+        <w:spacing w:before="40" w:after="100" w:line="276" w:lineRule="auto"/>
+      </w:pPr>
       <w:r>
+        <w:rPr>
+          <w:rFonts w:ascii="Arial" w:hAnsi="Arial"/>
+          <w:color w:val="263238"/>
+          <w:sz w:val="19"/>
+        </w:rPr>
         <w:t>Se desarrolló un protocolo de seguridad y congelamiento temporal de datos agronómicos distribuido:</w:t>
         <w:br/>
         <w:t>• En lib/utils/calendario_util.dart: Método puedeModificarSiembraPorFecha(fecha) que calcula la diferencia en días calendario entre la fecha de siembra y la fecha actual del sistema.</w:t>
@@ -1179,18 +1425,30 @@
       </w:r>
     </w:p>
     <w:p>
+      <w:pPr>
+        <w:keepNext/>
+        <w:spacing w:before="160" w:after="60"/>
+      </w:pPr>
       <w:r>
         <w:rPr>
           <w:rFonts w:ascii="Arial" w:hAnsi="Arial"/>
           <w:b/>
-          <w:color w:val="2E7D32"/>
-          <w:sz w:val="24"/>
+          <w:color w:val="558B2F"/>
+          <w:sz w:val="22"/>
         </w:rPr>
         <w:t>5.2 ¿Para qué sirve?</w:t>
       </w:r>
     </w:p>
     <w:p>
+      <w:pPr>
+        <w:spacing w:before="40" w:after="100" w:line="276" w:lineRule="auto"/>
+      </w:pPr>
       <w:r>
+        <w:rPr>
+          <w:rFonts w:ascii="Arial" w:hAnsi="Arial"/>
+          <w:color w:val="263238"/>
+          <w:sz w:val="19"/>
+        </w:rPr>
         <w:t>Sirve para blindar la gobernanza de datos y la seguridad contable y de auditoría de Buenavista Flowers:</w:t>
         <w:br/>
         <w:t>• Previene la adulteración retrospectiva o el borrado accidental de siembras de semanas anteriores en los dispositivos móviles de campo.</w:t>
@@ -1201,18 +1459,30 @@
       </w:r>
     </w:p>
     <w:p>
+      <w:pPr>
+        <w:keepNext/>
+        <w:spacing w:before="160" w:after="60"/>
+      </w:pPr>
       <w:r>
         <w:rPr>
           <w:rFonts w:ascii="Arial" w:hAnsi="Arial"/>
           <w:b/>
-          <w:color w:val="2E7D32"/>
-          <w:sz w:val="24"/>
+          <w:color w:val="558B2F"/>
+          <w:sz w:val="22"/>
         </w:rPr>
         <w:t>5.3 ¿Cómo funciona?</w:t>
       </w:r>
     </w:p>
     <w:p>
+      <w:pPr>
+        <w:spacing w:before="40" w:after="100" w:line="276" w:lineRule="auto"/>
+      </w:pPr>
       <w:r>
+        <w:rPr>
+          <w:rFonts w:ascii="Arial" w:hAnsi="Arial"/>
+          <w:color w:val="263238"/>
+          <w:sz w:val="19"/>
+        </w:rPr>
         <w:t>1. Cálculo Temporal: CalendarioUtil.parsearFecha extrae día, mes y año puros sin desfases de huso horario UTC. Se calcula: Delta_días = DateTime.now().difference(fechaSiembra).inDays.</w:t>
         <w:br/>
         <w:t>2. Evaluación Lógica: Si Delta_días &gt; 2, la función retorna false.</w:t>
@@ -1227,12 +1497,16 @@
       </w:r>
     </w:p>
     <w:p>
+      <w:pPr>
+        <w:keepNext/>
+        <w:spacing w:before="160" w:after="60"/>
+      </w:pPr>
       <w:r>
         <w:rPr>
           <w:rFonts w:ascii="Arial" w:hAnsi="Arial"/>
           <w:b/>
-          <w:color w:val="C62828"/>
-          <w:sz w:val="24"/>
+          <w:color w:val="558B2F"/>
+          <w:sz w:val="22"/>
         </w:rPr>
         <w:t>5.4 ¿Qué pasa si se quita?</w:t>
       </w:r>
@@ -1273,17 +1547,22 @@
               <w:rPr>
                 <w:rFonts w:ascii="Arial" w:hAnsi="Arial"/>
                 <w:b/>
-                <w:color w:val="1B5E20"/>
-                <w:sz w:val="22"/>
+                <w:color w:val="C62828"/>
+                <w:sz w:val="21"/>
               </w:rPr>
               <w:t>⚠️ Consecuencias Críticas si se Elimina el Bloqueo a 2 Días</w:t>
               <w:br/>
             </w:r>
+          </w:p>
+          <w:p>
+            <w:pPr>
+              <w:spacing w:before="0" w:after="40" w:line="276" w:lineRule="auto"/>
+            </w:pPr>
             <w:r>
               <w:rPr>
                 <w:rFonts w:ascii="Arial" w:hAnsi="Arial"/>
-                <w:color w:val="212121"/>
-                <w:sz w:val="20"/>
+                <w:color w:val="333333"/>
+                <w:sz w:val="19"/>
               </w:rPr>
               <w:t>• Vulnerabilidad de Fraude y Borrado Accidental: Un operario en campo podría borrar por error o manipular una siembra de hace dos semanas, destruyendo el historial de costos ya cerrado y facturado.</w:t>
               <w:br/>
@@ -1302,34 +1581,47 @@
     </w:p>
     <w:p>
       <w:pPr>
-        <w:spacing w:before="280"/>
+        <w:keepNext/>
+        <w:spacing w:before="280" w:after="120"/>
       </w:pPr>
       <w:r>
         <w:rPr>
           <w:rFonts w:ascii="Arial" w:hAnsi="Arial"/>
           <w:b/>
           <w:color w:val="1B5E20"/>
-          <w:sz w:val="30"/>
+          <w:sz w:val="28"/>
         </w:rPr>
         <w:t>6. Módulo de Gamificación, Podio de Medallas y Reportes Ejecutivos en PDF</w:t>
       </w:r>
     </w:p>
     <w:p>
+      <w:pPr>
+        <w:keepNext/>
+        <w:spacing w:before="160" w:after="60"/>
+      </w:pPr>
       <w:r>
         <w:rPr>
           <w:rFonts w:ascii="Arial" w:hAnsi="Arial"/>
           <w:b/>
-          <w:color w:val="2E7D32"/>
-          <w:sz w:val="24"/>
+          <w:color w:val="558B2F"/>
+          <w:sz w:val="22"/>
         </w:rPr>
         <w:t>6.1 ¿Qué se desarrolló?</w:t>
       </w:r>
     </w:p>
     <w:p>
+      <w:pPr>
+        <w:spacing w:before="40" w:after="100" w:line="276" w:lineRule="auto"/>
+      </w:pPr>
       <w:r>
+        <w:rPr>
+          <w:rFonts w:ascii="Arial" w:hAnsi="Arial"/>
+          <w:color w:val="263238"/>
+          <w:sz w:val="19"/>
+        </w:rPr>
         <w:t>Se desarrolló un panel avanzado de supervisión laboral (lib/screens/rendimiento_dialog.dart y lib/services/reporte_service.dart):</w:t>
         <w:br/>
-        <w:t>• Motor de Gamificación Laboral: Asigna medallas de honor en tiempo real: Oro 🥇 para el Top 1, Plata 🥈 para el Top 2 y Bronce 🥉 para el Top 3, con tarjetas destacadas en tonalidades doradas, bordes resaltados y desglose de camas cubiertas y tallos totales.</w:t>
+        <w:t>• Motor de Gamificación Laboral: Asigna medallas de honor en tiempo real: Oro para el Top 1, Plata para el Top 2 y Bronce para el Top 3, con tarjetas destacadas en tonalidades doradas, bordes resaltados y desglose de camas cubiertas y tallos totales.</w:t>
         <w:br/>
         <w:t>• Métricas de Velocidad y Eficiencia: Cálculo automático de promedio de tallos por cama y ritmo de avance.</w:t>
         <w:br/>
@@ -1337,52 +1629,392 @@
       </w:r>
     </w:p>
     <w:p>
+      <w:pPr>
+        <w:keepNext/>
+        <w:spacing w:before="160" w:after="60"/>
+      </w:pPr>
       <w:r>
         <w:rPr>
           <w:rFonts w:ascii="Arial" w:hAnsi="Arial"/>
           <w:b/>
-          <w:color w:val="2E7D32"/>
-          <w:sz w:val="24"/>
+          <w:color w:val="558B2F"/>
+          <w:sz w:val="22"/>
         </w:rPr>
         <w:t>6.2 ¿Para qué sirve?</w:t>
       </w:r>
     </w:p>
     <w:p>
+      <w:pPr>
+        <w:spacing w:before="40" w:after="100" w:line="276" w:lineRule="auto"/>
+      </w:pPr>
       <w:r>
+        <w:rPr>
+          <w:rFonts w:ascii="Arial" w:hAnsi="Arial"/>
+          <w:color w:val="263238"/>
+          <w:sz w:val="19"/>
+        </w:rPr>
         <w:t>• Motivación del Personal: La gamificación genera un clima de competencia positiva y reconocimiento tangible entre las cuadrillas.</w:t>
         <w:br/>
         <w:t>• Agilidad Administrativa: El supervisor puede generar el reporte en PDF al terminar la jornada, previsualizarlo e imprimirlo por Wi-Fi o Bluetooth o enviarlo inmediatamente por WhatsApp a la gerencia técnica sin pasar por digitadores de oficina.</w:t>
       </w:r>
     </w:p>
     <w:p>
+      <w:pPr>
+        <w:keepNext/>
+        <w:spacing w:before="160" w:after="60"/>
+      </w:pPr>
       <w:r>
         <w:rPr>
           <w:rFonts w:ascii="Arial" w:hAnsi="Arial"/>
           <w:b/>
-          <w:color w:val="2E7D32"/>
-          <w:sz w:val="24"/>
+          <w:color w:val="558B2F"/>
+          <w:sz w:val="22"/>
         </w:rPr>
         <w:t>6.3 ¿Cómo funciona?</w:t>
       </w:r>
     </w:p>
     <w:p>
+      <w:pPr>
+        <w:spacing w:before="40" w:after="100" w:line="276" w:lineRule="auto"/>
+      </w:pPr>
       <w:r>
+        <w:rPr>
+          <w:rFonts w:ascii="Arial" w:hAnsi="Arial"/>
+          <w:color w:val="263238"/>
+          <w:sz w:val="19"/>
+        </w:rPr>
         <w:t>1. Agrupación y Ordenamiento: El motor agrupa las siembras comerciales por operarioId y ordena descendentemente por total de tallos.</w:t>
         <w:br/>
-        <w:t>2. Asignación de Podio: El índice 0 recibe medalla de oro (🥇), el índice 1 plata (🥈) y el índice 2 bronce (🥉).</w:t>
+        <w:t>2. Asignación de Podio: El índice 0 recibe medalla de oro, el índice 1 plata y el índice 2 bronce.</w:t>
         <w:br/>
         <w:t>3. Compilación PDF: ReporteService utiliza la biblioteca pdf de Flutter para dibujar tablas tabulares vectoriales con colores corporativos, encabezados institucionales de Buenavista Flowers, paginación automática y resumen de totales.</w:t>
       </w:r>
     </w:p>
     <w:p>
+      <w:pPr>
+        <w:keepNext/>
+        <w:spacing w:before="160" w:after="60"/>
+      </w:pPr>
       <w:r>
         <w:rPr>
           <w:rFonts w:ascii="Arial" w:hAnsi="Arial"/>
           <w:b/>
-          <w:color w:val="C62828"/>
-          <w:sz w:val="24"/>
+          <w:color w:val="558B2F"/>
+          <w:sz w:val="22"/>
         </w:rPr>
         <w:t>6.4 ¿Qué pasa si se quita?</w:t>
+      </w:r>
+    </w:p>
+    <w:tbl>
+      <w:tblPr>
+        <w:tblW w:type="auto" w:w="0"/>
+        <w:jc w:val="center"/>
+        <w:tblLayout w:type="fixed"/>
+        <w:tblLook w:firstColumn="1" w:firstRow="1" w:lastColumn="0" w:lastRow="0" w:noHBand="0" w:noVBand="1" w:val="04A0"/>
+      </w:tblPr>
+      <w:tblGrid>
+        <w:gridCol w:w="9792"/>
+      </w:tblGrid>
+      <w:tr>
+        <w:tc>
+          <w:tcPr>
+            <w:tcW w:type="dxa" w:w="9360"/>
+            <w:shd w:fill="FFF3E0"/>
+            <w:tcMar>
+              <w:top w:w="140" w:type="dxa"/>
+              <w:bottom w:w="140" w:type="dxa"/>
+              <w:left w:w="200" w:type="dxa"/>
+              <w:right w:w="200" w:type="dxa"/>
+            </w:tcMar>
+            <w:tcBorders>
+              <w:left w:val="single" w:sz="36" w:space="0" w:color="F57C00"/>
+              <w:top w:val="none"/>
+              <w:right w:val="none"/>
+              <w:bottom w:val="none"/>
+            </w:tcBorders>
+          </w:tcPr>
+          <w:p>
+            <w:pPr>
+              <w:spacing w:before="40" w:after="80"/>
+            </w:pPr>
+            <w:r>
+              <w:rPr>
+                <w:rFonts w:ascii="Arial" w:hAnsi="Arial"/>
+                <w:b/>
+                <w:color w:val="F57C00"/>
+                <w:sz w:val="21"/>
+              </w:rPr>
+              <w:t>⚠️ Consecuencias si se Elimina el Módulo de Rendimiento y Reportes PDF</w:t>
+              <w:br/>
+            </w:r>
+          </w:p>
+          <w:p>
+            <w:pPr>
+              <w:spacing w:before="0" w:after="40" w:line="276" w:lineRule="auto"/>
+            </w:pPr>
+            <w:r>
+              <w:rPr>
+                <w:rFonts w:ascii="Arial" w:hAnsi="Arial"/>
+                <w:color w:val="333333"/>
+                <w:sz w:val="19"/>
+              </w:rPr>
+              <w:t>• Pérdida de Visibilidad Operativa: Los supervisores no tendrían cómo saber qué cuadrilla o trabajador avanzó más rápido durante la jornada.</w:t>
+              <w:br/>
+              <w:t>• Retorno a la Dependencia de Papel: Para entregar informes a gerencia se tendría que volver a transcribir los datos a mano o a Excel, anulando la ventaja de contar con una aplicación móvil en campo.</w:t>
+            </w:r>
+          </w:p>
+        </w:tc>
+      </w:tr>
+    </w:tbl>
+    <w:p>
+      <w:pPr>
+        <w:spacing w:before="0" w:after="80"/>
+      </w:pPr>
+    </w:p>
+    <w:p>
+      <w:pPr>
+        <w:keepNext/>
+        <w:spacing w:before="280" w:after="120"/>
+      </w:pPr>
+      <w:r>
+        <w:rPr>
+          <w:rFonts w:ascii="Arial" w:hAnsi="Arial"/>
+          <w:b/>
+          <w:color w:val="1B5E20"/>
+          <w:sz w:val="28"/>
+        </w:rPr>
+        <w:t>7. Módulo del Servidor Backend e Iniciar Backend (iniciar_backend.bat, FastAPI, Uvicorn y Sincronización Segura)</w:t>
+      </w:r>
+    </w:p>
+    <w:tbl>
+      <w:tblPr>
+        <w:tblW w:type="auto" w:w="0"/>
+        <w:jc w:val="center"/>
+        <w:tblLayout w:type="fixed"/>
+        <w:tblLook w:firstColumn="1" w:firstRow="1" w:lastColumn="0" w:lastRow="0" w:noHBand="0" w:noVBand="1" w:val="04A0"/>
+      </w:tblPr>
+      <w:tblGrid>
+        <w:gridCol w:w="9792"/>
+      </w:tblGrid>
+      <w:tr>
+        <w:tc>
+          <w:tcPr>
+            <w:tcW w:type="dxa" w:w="9360"/>
+            <w:shd w:fill="E8EAF6"/>
+            <w:tcMar>
+              <w:top w:w="140" w:type="dxa"/>
+              <w:bottom w:w="140" w:type="dxa"/>
+              <w:left w:w="200" w:type="dxa"/>
+              <w:right w:w="200" w:type="dxa"/>
+            </w:tcMar>
+            <w:tcBorders>
+              <w:left w:val="single" w:sz="36" w:space="0" w:color="303F9F"/>
+              <w:top w:val="none"/>
+              <w:right w:val="none"/>
+              <w:bottom w:val="none"/>
+            </w:tcBorders>
+          </w:tcPr>
+          <w:p>
+            <w:pPr>
+              <w:spacing w:before="40" w:after="80"/>
+            </w:pPr>
+            <w:r>
+              <w:rPr>
+                <w:rFonts w:ascii="Arial" w:hAnsi="Arial"/>
+                <w:b/>
+                <w:color w:val="303F9F"/>
+                <w:sz w:val="21"/>
+              </w:rPr>
+              <w:t>🖥️ El Puente Neuronal del Ecosistema: Offline-First a Base de Datos Central</w:t>
+              <w:br/>
+            </w:r>
+          </w:p>
+          <w:p>
+            <w:pPr>
+              <w:spacing w:before="0" w:after="40" w:line="276" w:lineRule="auto"/>
+            </w:pPr>
+            <w:r>
+              <w:rPr>
+                <w:rFonts w:ascii="Arial" w:hAnsi="Arial"/>
+                <w:color w:val="333333"/>
+                <w:sz w:val="19"/>
+              </w:rPr>
+              <w:t>El backend y su script lanzador 'iniciar_backend.bat' constituyen la infraestructura medular que conecta los dispositivos Android de campo con la base de datos empresarial histórica 'bmempresarial2021.accdb' (Microsoft Access de más de 865 MB). Sin este puente, las aplicaciones móviles operarían en una isla sin capacidad de sincronizar inventarios, nóminas ni catálogos oficiales.</w:t>
+            </w:r>
+          </w:p>
+        </w:tc>
+      </w:tr>
+    </w:tbl>
+    <w:p>
+      <w:pPr>
+        <w:spacing w:before="0" w:after="80"/>
+      </w:pPr>
+    </w:p>
+    <w:p>
+      <w:pPr>
+        <w:keepNext/>
+        <w:spacing w:before="160" w:after="60"/>
+      </w:pPr>
+      <w:r>
+        <w:rPr>
+          <w:rFonts w:ascii="Arial" w:hAnsi="Arial"/>
+          <w:b/>
+          <w:color w:val="558B2F"/>
+          <w:sz w:val="22"/>
+        </w:rPr>
+        <w:t>7.1 ¿Qué se desarrolló?</w:t>
+      </w:r>
+    </w:p>
+    <w:p>
+      <w:pPr>
+        <w:spacing w:before="40" w:after="100" w:line="276" w:lineRule="auto"/>
+      </w:pPr>
+      <w:r>
+        <w:rPr>
+          <w:rFonts w:ascii="Arial" w:hAnsi="Arial"/>
+          <w:color w:val="263238"/>
+          <w:sz w:val="19"/>
+        </w:rPr>
+        <w:t>Se desarrolló un ecosistema de servidor completo compuesto por los siguientes componentes de ingeniería:</w:t>
+        <w:br/>
+        <w:br/>
+        <w:t>1. Script Lanzador Automatizado ('iniciar_backend.bat'):</w:t>
+        <w:br/>
+        <w:t xml:space="preserve">   • Archivo de procesamiento por lotes (.bat) diseñado para ejecución 'un solo clic' en el servidor/PC de la oficina central.</w:t>
+        <w:br/>
+        <w:t xml:space="preserve">   • Interfaz estilizada de consola Windows con fondo verde esmeralda y texto blanco brillante ('color 2F') y título personalizado ('title Servidor Backend - Siembras Buenavista Flowers').</w:t>
+        <w:br/>
+        <w:t xml:space="preserve">   • Detección Dinámica de IP Local: Ejecuta la consulta de red 'route print | findstr 0.0.0.0' para extraer la dirección IP real de la máquina anfitriona en la red Wi-Fi (ej. 192.168.1.39) sin requerir que el operador abra la consola o use 'ipconfig'.</w:t>
+        <w:br/>
+        <w:t xml:space="preserve">   • Publicación de Endpoint: Despliega en pantalla la URL exacta a la que deben apuntar las tablets y teléfonos Android (http://192.168.1.39:8000/api).</w:t>
+        <w:br/>
+        <w:t xml:space="preserve">   • Cambio de Directorio y Arranque: Navega de forma segura al directorio relativo ('cd /d "%~dp0backend"') y lanza el servicio mediante 'python run.py'.</w:t>
+        <w:br/>
+        <w:t xml:space="preserve">   • Control de Excepciones ('pause'): Mantiene la consola abierta si ocurre algún error, facilitando el diagnóstico por parte del equipo de soporte.</w:t>
+        <w:br/>
+        <w:br/>
+        <w:t>2. Servidor Web Asíncrono de Alto Desempeño ('backend/run.py' y 'backend/app/main.py'):</w:t>
+        <w:br/>
+        <w:t xml:space="preserve">   • Arquitectura ASGI basada en FastAPI montada sobre el motor Uvicorn, escuchando en todas las interfaces de red ('0.0.0.0:8000') con recarga en caliente ('reload=True').</w:t>
+        <w:br/>
+        <w:t xml:space="preserve">   • Middleware de Concurrencia y Serialización ('db_lock' en 'backend/app/db/connection.py'): Implementación de un candado global multi-hilo ('threading.Lock()') que serializa todas las transacciones hacia Microsoft Access, garantizando que el driver ODBC no sufra colisiones ni corrupciones por escrituras simultáneas.</w:t>
+        <w:br/>
+        <w:t xml:space="preserve">   • Cadena de Conexión en Modo Compartido ('Exclusive=0', 'ExtendedAnsiSQL=1'): Permite que los empleados de oficina mantengan abierta la base de datos 'bmempresarial2021.accdb' en Microsoft Access mientras los teléfonos sincronizan en segundo plano sin bloqueos de archivo.</w:t>
+        <w:br/>
+        <w:t xml:space="preserve">   • Auto-Reparación y Creación del Esquema ('ensure_database_schema'): En el evento de arranque ('@app.on_event("startup")') y en cada conexión, el backend verifica si la tabla 't_siembras_app' existe. Si se restaura una base de datos limpia que no la tiene, la crea automáticamente con clave primaria UUID sin tocar ninguna tabla nativa.</w:t>
+        <w:br/>
+        <w:t xml:space="preserve">   • Subsistema de Respaldos Preventivos en Segundo Plano ('safe_backup_database'): Hilo demonio asíncrono ('threading.Thread') que genera respaldos rotativos automáticos por hora en la carpeta 'backups_seguridad/' ('bmempresarial2021_backup_YYYYMMDD_HH.accdb'), reteniendo las últimas 5 copias para proteger el sistema ante apagones o fallas de disco.</w:t>
+        <w:br/>
+        <w:t xml:space="preserve">   • Motor de Sincronización Masiva en 5 Tablas Empresariales ('/api/sync/siembras'): Recibe lotes de siembras, normaliza fechas estrictas a '00:00:00' (formato DD/MM/YYYY en Access), calcula correlativos en memoria ('MAX(t31)', 'MAX(t51)', 'MAX(t102)', 'MAX(t50)') e impacta de forma atómica: t_siembras_app (auditoría), t31_encnovcampo (encabezado), t51_detnovcampo (detalle agronómico), t102_composcama (histórico), t50_mcomposcama (ocupación activa respetando multivariedad) y t49_mcamas (estado físico de la cama).</w:t>
+        <w:br/>
+        <w:t xml:space="preserve">   • Distribución de Catálogos Oficiales ('/api/catalogs/'): Expone endpoints para sincronizar bloques (t17), camas (t49), familias (t09), series (t10), colores (t08), variedades (t11), empleados/operarios (t159) y configuraciones agronómicas maestras.</w:t>
+      </w:r>
+    </w:p>
+    <w:p>
+      <w:pPr>
+        <w:keepNext/>
+        <w:spacing w:before="160" w:after="60"/>
+      </w:pPr>
+      <w:r>
+        <w:rPr>
+          <w:rFonts w:ascii="Arial" w:hAnsi="Arial"/>
+          <w:b/>
+          <w:color w:val="558B2F"/>
+          <w:sz w:val="22"/>
+        </w:rPr>
+        <w:t>7.2 ¿Para qué sirve?</w:t>
+      </w:r>
+    </w:p>
+    <w:p>
+      <w:pPr>
+        <w:spacing w:before="40" w:after="100" w:line="276" w:lineRule="auto"/>
+      </w:pPr>
+      <w:r>
+        <w:rPr>
+          <w:rFonts w:ascii="Arial" w:hAnsi="Arial"/>
+          <w:color w:val="263238"/>
+          <w:sz w:val="19"/>
+        </w:rPr>
+        <w:t>El módulo del backend cumple cinco funciones vitales en la operación de Buenavista Flowers:</w:t>
+        <w:br/>
+        <w:br/>
+        <w:t>• Conexión Inalámbrica Transparente: Permite que las cuadrillas de campo recolecten información sin cables ni planillas de papel, sincronizando los datos directamente desde el celular a la base central de la empresa.</w:t>
+        <w:br/>
+        <w:t>• Operación 'Offline-First' Confiable: Otorga total autonomía a los dispositivos móviles para sembrar en zonas profundas de invernadero sin Wi-Fi; al regresar al alcance de la red, una sola pulsación envía todos los registros al servidor.</w:t>
+        <w:br/>
+        <w:t>• Protección Absoluta del Archivo Access de 865 MB: Microsoft Access no tolera conexiones de red concurrentes directas sin intermediario. El backend actúa como una aduana blindada que previene la corrupción catastrófica de 20 años de historia empresarial.</w:t>
+        <w:br/>
+        <w:t>• Cero Complicación Técnica para Usuarios ('iniciar_backend.bat'): Cualquier empleado de oficina, supervisor o secretaria puede encender el servidor con solo hacer doble clic en el archivo .bat, sin tener que saber comandos de consola, puertos ni configuraciones de red.</w:t>
+        <w:br/>
+        <w:t>• Sincronización Bidireccional de Catálogos: Si en la oficina se registra una nueva variedad o se contrata a un nuevo sembrador en Access, los celulares descargan de inmediato estos cambios al sincronizar catálogos.</w:t>
+      </w:r>
+    </w:p>
+    <w:p>
+      <w:pPr>
+        <w:keepNext/>
+        <w:spacing w:before="160" w:after="60"/>
+      </w:pPr>
+      <w:r>
+        <w:rPr>
+          <w:rFonts w:ascii="Arial" w:hAnsi="Arial"/>
+          <w:b/>
+          <w:color w:val="558B2F"/>
+          <w:sz w:val="22"/>
+        </w:rPr>
+        <w:t>7.3 ¿Cómo funciona?</w:t>
+      </w:r>
+    </w:p>
+    <w:p>
+      <w:pPr>
+        <w:spacing w:before="40" w:after="100" w:line="276" w:lineRule="auto"/>
+      </w:pPr>
+      <w:r>
+        <w:rPr>
+          <w:rFonts w:ascii="Arial" w:hAnsi="Arial"/>
+          <w:color w:val="263238"/>
+          <w:sz w:val="19"/>
+        </w:rPr>
+        <w:t>El ciclo operativo del backend sigue una secuencia determinista de 6 pasos:</w:t>
+        <w:br/>
+        <w:br/>
+        <w:t>1. Ejecución del Lanzador: El usuario hace doble clic en 'iniciar_backend.bat'. El script ejecuta 'route print', detecta la tarjeta de red activa, muestra la IP (ej. 192.168.1.39), tiñe la consola de verde corporativo y ejecuta 'python run.py'.</w:t>
+        <w:br/>
+        <w:t>2. Inicialización del Servidor: Uvicorn monta FastAPI en '0.0.0.0:8000'. En el evento 'startup', abre un canal ODBC hacia 'bmempresarial2021.accdb', verifica que 't_siembras_app' exista, dispara la copia preventiva horaria en segundo plano y confirma disponibilidad.</w:t>
+        <w:br/>
+        <w:t>3. Captura Offline en Campo: En los invernaderos, los supervisores digitan siembras en la App Móvil (almacenadas localmente en SQLite con el campo 'sincronizado = 0').</w:t>
+        <w:br/>
+        <w:t>4. Solicitud de Sincronización: Al conectarse a la red Wi-Fi de la empresa, el supervisor pulsa 'Sincronizar' en la app. La app envía un paquete HTTP POST con el listado JSON de siembras a 'http://192.168.1.39:8000/api/sync/siembras' autenticado con la API Key configurada.</w:t>
+        <w:br/>
+        <w:t>5. Procesamiento Transaccional y Bloqueo 'db_lock':</w:t>
+        <w:br/>
+        <w:t xml:space="preserve">   - El backend adquiere 'db_lock.acquire()', congelando temporalmente cualquier otra escritura para evitar colisiones en Access.</w:t>
+        <w:br/>
+        <w:t xml:space="preserve">   - Abre la conexión ODBC con 'Exclusive=0'.</w:t>
+        <w:br/>
+        <w:t xml:space="preserve">   - Normaliza estrictamente las fechas a las 00:00:00 (evitando discrepancias horarias).</w:t>
+        <w:br/>
+        <w:t xml:space="preserve">   - Inserta la auditoría móvil en 't_siembras_app' con su UUID.</w:t>
+        <w:br/>
+        <w:t xml:space="preserve">   - Si la siembra es activa, actualiza atómicamente t31, t51, t102, t50 y t49, preservando otras variedades en camas multivariedad si su ciclo no ha vencido.</w:t>
+        <w:br/>
+        <w:t xml:space="preserve">   - Ejecuta 'conn.commit()' y libera 'db_lock.release()'.</w:t>
+        <w:br/>
+        <w:t>6. Confirmación a la App Móvil: El backend responde con HTTP 200 y la lista de UUIDs confirmados ('committed'). La aplicación móvil actualiza SQLite marcando 'sincronizado = 1' y despliega el diálogo de confirmación exitosa al usuario.</w:t>
+      </w:r>
+    </w:p>
+    <w:p>
+      <w:pPr>
+        <w:keepNext/>
+        <w:spacing w:before="160" w:after="60"/>
+      </w:pPr>
+      <w:r>
+        <w:rPr>
+          <w:rFonts w:ascii="Arial" w:hAnsi="Arial"/>
+          <w:b/>
+          <w:color w:val="558B2F"/>
+          <w:sz w:val="22"/>
+        </w:rPr>
+        <w:t>7.4 ¿Qué pasa si se quita?</w:t>
       </w:r>
     </w:p>
     <w:tbl>
@@ -1421,21 +2053,32 @@
               <w:rPr>
                 <w:rFonts w:ascii="Arial" w:hAnsi="Arial"/>
                 <w:b/>
-                <w:color w:val="1B5E20"/>
-                <w:sz w:val="22"/>
+                <w:color w:val="C62828"/>
+                <w:sz w:val="21"/>
               </w:rPr>
-              <w:t>⚠️ Consecuencias si se Elimina el Módulo de Rendimiento y Reportes PDF</w:t>
+              <w:t>🚨 Consecuencias Catastróficas si se Elimina el Backend o 'iniciar_backend.bat'</w:t>
               <w:br/>
             </w:r>
+          </w:p>
+          <w:p>
+            <w:pPr>
+              <w:spacing w:before="0" w:after="40" w:line="276" w:lineRule="auto"/>
+            </w:pPr>
             <w:r>
               <w:rPr>
                 <w:rFonts w:ascii="Arial" w:hAnsi="Arial"/>
-                <w:color w:val="212121"/>
-                <w:sz w:val="20"/>
+                <w:color w:val="333333"/>
+                <w:sz w:val="19"/>
               </w:rPr>
-              <w:t>• Pérdida de Visibilidad Operativa: Los supervisores no tendrían cómo saber qué cuadrilla o trabajador avanzó más rápido durante la jornada.</w:t>
+              <w:t>1. Incomunicación Total de los Dispositivos Móviles: Los teléfonos y tablets Android quedarían aislados en una isla offline perpetua. Ningún dato de siembra de campo podría ingresar jamás a la base de datos empresarial.</w:t>
               <w:br/>
-              <w:t>• Retorno a la Dependencia de Papel: Para entregar informes a gerencia se tendría que volver a transcribir los datos a mano o a Excel, anulando la ventaja de contar con una aplicación móvil en campo.</w:t>
+              <w:t>2. Imposibilidad Técnica de Conexión: El sistema operativo Android no posee soporte para drivers ODBC de Microsoft Jet/ACE ni protocolo de red SMB compartido de Access. Sin este backend en FastAPI, es técnicamente imposible que un celular hable con un archivo .accdb.</w:t>
+              <w:br/>
+              <w:t>3. Riesgo Crítico de Corrupción de la Base de Datos: Si se intentara conectar clientes móviles de forma directa o concurrente sin el control 'db_lock' y 'Exclusive=0', la base de datos empresarial de 865 MB se corrompería irreparablemente en minutos.</w:t>
+              <w:br/>
+              <w:t>4. Parálisis de Catálogos: Si se crean nuevas camas o variedades en Access, los celulares nunca se enterarían, obligando a ingresar datos a ciegas o recompilar la aplicación móvil.</w:t>
+              <w:br/>
+              <w:t>5. Pérdida del Sistema de Respaldos Automáticos: Quedaría desmantelado el subsistema horario de copias de seguridad en 'backups_seguridad/', dejando desprotegida la base de datos ante caídas de tensión o fallos del disco duro.</w:t>
             </w:r>
           </w:p>
         </w:tc>
@@ -1447,19 +2090,31 @@
       </w:pPr>
     </w:p>
     <w:p>
-      <w:r>
-        <w:br w:type="page"/>
-      </w:r>
-    </w:p>
-    <w:p>
+      <w:pPr>
+        <w:keepNext/>
+        <w:spacing w:before="280" w:after="120"/>
+      </w:pPr>
       <w:r>
         <w:rPr>
           <w:rFonts w:ascii="Arial" w:hAnsi="Arial"/>
           <w:b/>
           <w:color w:val="1B5E20"/>
-          <w:sz w:val="30"/>
+          <w:sz w:val="28"/>
         </w:rPr>
-        <w:t>7. Matriz Comparativa de Riesgo e Impacto Cruzado: ¿Qué Pasa si se Quita Cada Módulo?</w:t>
+        <w:t>8. Matriz Comparativa de Riesgo e Impacto Cruzado: ¿Qué Pasa si se Quita Cada Módulo?</w:t>
+      </w:r>
+    </w:p>
+    <w:p>
+      <w:pPr>
+        <w:spacing w:before="40" w:after="100" w:line="276" w:lineRule="auto"/>
+      </w:pPr>
+      <w:r>
+        <w:rPr>
+          <w:rFonts w:ascii="Arial" w:hAnsi="Arial"/>
+          <w:color w:val="263238"/>
+          <w:sz w:val="19"/>
+        </w:rPr>
+        <w:t>A continuación se presenta la matriz consolidada de riesgo operativo y arquitectural del sistema. Esta tabla sintetiza la criticidad de cada uno de los 7 módulos desarrollados, las áreas de la compañía directamente afectadas y el impacto operativo inmediato que sufriría Buenavista Flowers si alguno de estos componentes fuese removido:</w:t>
       </w:r>
     </w:p>
     <w:tbl>
@@ -1481,19 +2136,22 @@
             <w:tcW w:type="dxa" w:w="2592"/>
             <w:shd w:fill="1B5E20"/>
             <w:tcMar>
-              <w:top w:w="100" w:type="dxa"/>
-              <w:bottom w:w="100" w:type="dxa"/>
-              <w:left w:w="100" w:type="dxa"/>
-              <w:right w:w="100" w:type="dxa"/>
+              <w:top w:w="120" w:type="dxa"/>
+              <w:bottom w:w="120" w:type="dxa"/>
+              <w:left w:w="140" w:type="dxa"/>
+              <w:right w:w="140" w:type="dxa"/>
             </w:tcMar>
           </w:tcPr>
           <w:p>
+            <w:pPr>
+              <w:jc w:val="center"/>
+            </w:pPr>
             <w:r>
               <w:rPr>
                 <w:rFonts w:ascii="Arial" w:hAnsi="Arial"/>
                 <w:b/>
                 <w:color w:val="FFFFFF"/>
-                <w:sz w:val="19"/>
+                <w:sz w:val="18"/>
               </w:rPr>
               <w:t>Componente Desarrollado</w:t>
             </w:r>
@@ -1501,24 +2159,53 @@
         </w:tc>
         <w:tc>
           <w:tcPr>
-            <w:tcW w:type="dxa" w:w="1584"/>
+            <w:tcW w:type="dxa" w:w="1872"/>
             <w:shd w:fill="1B5E20"/>
             <w:tcMar>
-              <w:top w:w="100" w:type="dxa"/>
-              <w:bottom w:w="100" w:type="dxa"/>
-              <w:left w:w="100" w:type="dxa"/>
-              <w:right w:w="100" w:type="dxa"/>
+              <w:top w:w="120" w:type="dxa"/>
+              <w:bottom w:w="120" w:type="dxa"/>
+              <w:left w:w="140" w:type="dxa"/>
+              <w:right w:w="140" w:type="dxa"/>
             </w:tcMar>
           </w:tcPr>
           <w:p>
+            <w:pPr>
+              <w:jc w:val="center"/>
+            </w:pPr>
             <w:r>
               <w:rPr>
                 <w:rFonts w:ascii="Arial" w:hAnsi="Arial"/>
                 <w:b/>
                 <w:color w:val="FFFFFF"/>
-                <w:sz w:val="19"/>
+                <w:sz w:val="18"/>
               </w:rPr>
               <w:t>Nivel de Criticidad</w:t>
+            </w:r>
+          </w:p>
+        </w:tc>
+        <w:tc>
+          <w:tcPr>
+            <w:tcW w:type="dxa" w:w="2304"/>
+            <w:shd w:fill="1B5E20"/>
+            <w:tcMar>
+              <w:top w:w="120" w:type="dxa"/>
+              <w:bottom w:w="120" w:type="dxa"/>
+              <w:left w:w="140" w:type="dxa"/>
+              <w:right w:w="140" w:type="dxa"/>
+            </w:tcMar>
+          </w:tcPr>
+          <w:p>
+            <w:pPr>
+              <w:jc w:val="center"/>
+            </w:pPr>
+            <w:r>
+              <w:rPr>
+                <w:rFonts w:ascii="Arial" w:hAnsi="Arial"/>
+                <w:b/>
+                <w:color w:val="FFFFFF"/>
+                <w:sz w:val="18"/>
+              </w:rPr>
+              <w:t>Área Directamente Afectada</w:t>
             </w:r>
           </w:p>
         </w:tc>
@@ -1527,42 +2214,22 @@
             <w:tcW w:type="dxa" w:w="2592"/>
             <w:shd w:fill="1B5E20"/>
             <w:tcMar>
-              <w:top w:w="100" w:type="dxa"/>
-              <w:bottom w:w="100" w:type="dxa"/>
-              <w:left w:w="100" w:type="dxa"/>
-              <w:right w:w="100" w:type="dxa"/>
+              <w:top w:w="120" w:type="dxa"/>
+              <w:bottom w:w="120" w:type="dxa"/>
+              <w:left w:w="140" w:type="dxa"/>
+              <w:right w:w="140" w:type="dxa"/>
             </w:tcMar>
           </w:tcPr>
           <w:p>
+            <w:pPr>
+              <w:jc w:val="center"/>
+            </w:pPr>
             <w:r>
               <w:rPr>
                 <w:rFonts w:ascii="Arial" w:hAnsi="Arial"/>
                 <w:b/>
                 <w:color w:val="FFFFFF"/>
-                <w:sz w:val="19"/>
-              </w:rPr>
-              <w:t>Área Directamente Afectada</w:t>
-            </w:r>
-          </w:p>
-        </w:tc>
-        <w:tc>
-          <w:tcPr>
-            <w:tcW w:type="dxa" w:w="3168"/>
-            <w:shd w:fill="1B5E20"/>
-            <w:tcMar>
-              <w:top w:w="100" w:type="dxa"/>
-              <w:bottom w:w="100" w:type="dxa"/>
-              <w:left w:w="100" w:type="dxa"/>
-              <w:right w:w="100" w:type="dxa"/>
-            </w:tcMar>
-          </w:tcPr>
-          <w:p>
-            <w:r>
-              <w:rPr>
-                <w:rFonts w:ascii="Arial" w:hAnsi="Arial"/>
-                <w:b/>
-                <w:color w:val="FFFFFF"/>
-                <w:sz w:val="19"/>
+                <w:sz w:val="18"/>
               </w:rPr>
               <w:t>Impacto Operativo si se Elimina</w:t>
             </w:r>
@@ -1573,42 +2240,40 @@
         <w:tc>
           <w:tcPr>
             <w:tcW w:type="dxa" w:w="2592"/>
-            <w:shd w:fill="FFFFFF"/>
+            <w:shd w:fill="E8F5E9"/>
             <w:tcMar>
-              <w:top w:w="80" w:type="dxa"/>
-              <w:bottom w:w="80" w:type="dxa"/>
-              <w:left w:w="90" w:type="dxa"/>
-              <w:right w:w="90" w:type="dxa"/>
+              <w:top w:w="90" w:type="dxa"/>
+              <w:bottom w:w="90" w:type="dxa"/>
+              <w:left w:w="120" w:type="dxa"/>
+              <w:right w:w="120" w:type="dxa"/>
             </w:tcMar>
           </w:tcPr>
           <w:p>
-            <w:pPr>
-              <w:spacing w:before="40" w:after="40"/>
-            </w:pPr>
             <w:r>
               <w:rPr>
                 <w:rFonts w:ascii="Arial" w:hAnsi="Arial"/>
-                <w:color w:val="212121"/>
+                <w:b/>
+                <w:color w:val="1B5E20"/>
                 <w:sz w:val="17"/>
               </w:rPr>
-              <w:t>División Bilateral de Camas (Pompón 13/12, Cremón 11/11)</w:t>
+              <w:t>1. División Bilateral de Camas (Pompón 13/12, Cremón 11/11)</w:t>
             </w:r>
           </w:p>
         </w:tc>
         <w:tc>
           <w:tcPr>
-            <w:tcW w:type="dxa" w:w="1584"/>
-            <w:shd w:fill="FFFFFF"/>
+            <w:tcW w:type="dxa" w:w="1872"/>
+            <w:shd w:fill="E8F5E9"/>
             <w:tcMar>
-              <w:top w:w="80" w:type="dxa"/>
-              <w:bottom w:w="80" w:type="dxa"/>
-              <w:left w:w="90" w:type="dxa"/>
-              <w:right w:w="90" w:type="dxa"/>
+              <w:top w:w="90" w:type="dxa"/>
+              <w:bottom w:w="90" w:type="dxa"/>
+              <w:left w:w="120" w:type="dxa"/>
+              <w:right w:w="120" w:type="dxa"/>
             </w:tcMar>
           </w:tcPr>
           <w:p>
             <w:pPr>
-              <w:spacing w:before="40" w:after="40"/>
+              <w:jc w:val="center"/>
             </w:pPr>
             <w:r>
               <w:rPr>
@@ -1617,29 +2282,28 @@
                 <w:color w:val="C62828"/>
                 <w:sz w:val="17"/>
               </w:rPr>
-              <w:t>CRÍTICA (9.5/10)</w:t>
+              <w:t>CRÍTICA</w:t>
+              <w:br/>
+              <w:t>(9.5 / 10)</w:t>
             </w:r>
           </w:p>
         </w:tc>
         <w:tc>
           <w:tcPr>
-            <w:tcW w:type="dxa" w:w="2592"/>
-            <w:shd w:fill="FFFFFF"/>
+            <w:tcW w:type="dxa" w:w="2304"/>
+            <w:shd w:fill="E8F5E9"/>
             <w:tcMar>
-              <w:top w:w="80" w:type="dxa"/>
-              <w:bottom w:w="80" w:type="dxa"/>
-              <w:left w:w="90" w:type="dxa"/>
-              <w:right w:w="90" w:type="dxa"/>
+              <w:top w:w="90" w:type="dxa"/>
+              <w:bottom w:w="90" w:type="dxa"/>
+              <w:left w:w="120" w:type="dxa"/>
+              <w:right w:w="120" w:type="dxa"/>
             </w:tcMar>
           </w:tcPr>
           <w:p>
-            <w:pPr>
-              <w:spacing w:before="40" w:after="40"/>
-            </w:pPr>
             <w:r>
               <w:rPr>
                 <w:rFonts w:ascii="Arial" w:hAnsi="Arial"/>
-                <w:color w:val="212121"/>
+                <w:color w:val="263238"/>
                 <w:sz w:val="17"/>
               </w:rPr>
               <w:t>Inventario Agronómico y Nómina por Esqueje</w:t>
@@ -1648,129 +2312,23 @@
         </w:tc>
         <w:tc>
           <w:tcPr>
-            <w:tcW w:type="dxa" w:w="3168"/>
-            <w:shd w:fill="FFFFFF"/>
+            <w:tcW w:type="dxa" w:w="2592"/>
+            <w:shd w:fill="E8F5E9"/>
             <w:tcMar>
-              <w:top w:w="80" w:type="dxa"/>
-              <w:bottom w:w="80" w:type="dxa"/>
-              <w:left w:w="90" w:type="dxa"/>
-              <w:right w:w="90" w:type="dxa"/>
+              <w:top w:w="90" w:type="dxa"/>
+              <w:bottom w:w="90" w:type="dxa"/>
+              <w:left w:w="120" w:type="dxa"/>
+              <w:right w:w="120" w:type="dxa"/>
             </w:tcMar>
           </w:tcPr>
           <w:p>
-            <w:pPr>
-              <w:spacing w:before="40" w:after="40"/>
-            </w:pPr>
             <w:r>
               <w:rPr>
                 <w:rFonts w:ascii="Arial" w:hAnsi="Arial"/>
-                <w:color w:val="212121"/>
+                <w:color w:val="263238"/>
                 <w:sz w:val="17"/>
               </w:rPr>
-              <w:t>Descuadre continuo de inventario vegetal (~130 plantas por cama). Liquidación errónea de pagos a sembradores.</w:t>
-            </w:r>
-          </w:p>
-        </w:tc>
-      </w:tr>
-      <w:tr>
-        <w:tc>
-          <w:tcPr>
-            <w:tcW w:type="dxa" w:w="2592"/>
-            <w:shd w:fill="FAFAFA"/>
-            <w:tcMar>
-              <w:top w:w="80" w:type="dxa"/>
-              <w:bottom w:w="80" w:type="dxa"/>
-              <w:left w:w="90" w:type="dxa"/>
-              <w:right w:w="90" w:type="dxa"/>
-            </w:tcMar>
-          </w:tcPr>
-          <w:p>
-            <w:pPr>
-              <w:spacing w:before="40" w:after="40"/>
-            </w:pPr>
-            <w:r>
-              <w:rPr>
-                <w:rFonts w:ascii="Arial" w:hAnsi="Arial"/>
-                <w:color w:val="212121"/>
-                <w:sz w:val="17"/>
-              </w:rPr>
-              <w:t>Modo Mixto ('Pasó al otro lado')</w:t>
-            </w:r>
-          </w:p>
-        </w:tc>
-        <w:tc>
-          <w:tcPr>
-            <w:tcW w:type="dxa" w:w="1584"/>
-            <w:shd w:fill="FAFAFA"/>
-            <w:tcMar>
-              <w:top w:w="80" w:type="dxa"/>
-              <w:bottom w:w="80" w:type="dxa"/>
-              <w:left w:w="90" w:type="dxa"/>
-              <w:right w:w="90" w:type="dxa"/>
-            </w:tcMar>
-          </w:tcPr>
-          <w:p>
-            <w:pPr>
-              <w:spacing w:before="40" w:after="40"/>
-            </w:pPr>
-            <w:r>
-              <w:rPr>
-                <w:rFonts w:ascii="Arial" w:hAnsi="Arial"/>
-                <w:b/>
-                <w:color w:val="EF6C00"/>
-                <w:sz w:val="17"/>
-              </w:rPr>
-              <w:t>ALTA (8.5/10)</w:t>
-            </w:r>
-          </w:p>
-        </w:tc>
-        <w:tc>
-          <w:tcPr>
-            <w:tcW w:type="dxa" w:w="2592"/>
-            <w:shd w:fill="FAFAFA"/>
-            <w:tcMar>
-              <w:top w:w="80" w:type="dxa"/>
-              <w:bottom w:w="80" w:type="dxa"/>
-              <w:left w:w="90" w:type="dxa"/>
-              <w:right w:w="90" w:type="dxa"/>
-            </w:tcMar>
-          </w:tcPr>
-          <w:p>
-            <w:pPr>
-              <w:spacing w:before="40" w:after="40"/>
-            </w:pPr>
-            <w:r>
-              <w:rPr>
-                <w:rFonts w:ascii="Arial" w:hAnsi="Arial"/>
-                <w:color w:val="212121"/>
-                <w:sz w:val="17"/>
-              </w:rPr>
-              <w:t>Operaciones de Cuadrilla y Trazabilidad</w:t>
-            </w:r>
-          </w:p>
-        </w:tc>
-        <w:tc>
-          <w:tcPr>
-            <w:tcW w:type="dxa" w:w="3168"/>
-            <w:shd w:fill="FAFAFA"/>
-            <w:tcMar>
-              <w:top w:w="80" w:type="dxa"/>
-              <w:bottom w:w="80" w:type="dxa"/>
-              <w:left w:w="90" w:type="dxa"/>
-              <w:right w:w="90" w:type="dxa"/>
-            </w:tcMar>
-          </w:tcPr>
-          <w:p>
-            <w:pPr>
-              <w:spacing w:before="40" w:after="40"/>
-            </w:pPr>
-            <w:r>
-              <w:rPr>
-                <w:rFonts w:ascii="Arial" w:hAnsi="Arial"/>
-                <w:color w:val="212121"/>
-                <w:sz w:val="17"/>
-              </w:rPr>
-              <w:t>Obligación de falsear datos o promediar líneas cuando un sembrador ayuda a otro. Pérdida de auditoría de calidad.</w:t>
+              <w:t>Descuadre continuo de inventario vegetal (~130 plantas por cama). Liquidación errónea e injusta de pagos a sembradores.</w:t>
             </w:r>
           </w:p>
         </w:tc>
@@ -1781,40 +2339,38 @@
             <w:tcW w:type="dxa" w:w="2592"/>
             <w:shd w:fill="FFFFFF"/>
             <w:tcMar>
-              <w:top w:w="80" w:type="dxa"/>
-              <w:bottom w:w="80" w:type="dxa"/>
-              <w:left w:w="90" w:type="dxa"/>
-              <w:right w:w="90" w:type="dxa"/>
+              <w:top w:w="90" w:type="dxa"/>
+              <w:bottom w:w="90" w:type="dxa"/>
+              <w:left w:w="120" w:type="dxa"/>
+              <w:right w:w="120" w:type="dxa"/>
             </w:tcMar>
           </w:tcPr>
           <w:p>
-            <w:pPr>
-              <w:spacing w:before="40" w:after="40"/>
-            </w:pPr>
             <w:r>
               <w:rPr>
                 <w:rFonts w:ascii="Arial" w:hAnsi="Arial"/>
-                <w:color w:val="212121"/>
+                <w:b/>
+                <w:color w:val="1B5E20"/>
                 <w:sz w:val="17"/>
               </w:rPr>
-              <w:t>Supresión de Sembrador en Propagación (Madres/Bancos)</w:t>
+              <w:t>2. Modo Mixto ('Pasó al otro lado')</w:t>
             </w:r>
           </w:p>
         </w:tc>
         <w:tc>
           <w:tcPr>
-            <w:tcW w:type="dxa" w:w="1584"/>
+            <w:tcW w:type="dxa" w:w="1872"/>
             <w:shd w:fill="FFFFFF"/>
             <w:tcMar>
-              <w:top w:w="80" w:type="dxa"/>
-              <w:bottom w:w="80" w:type="dxa"/>
-              <w:left w:w="90" w:type="dxa"/>
-              <w:right w:w="90" w:type="dxa"/>
+              <w:top w:w="90" w:type="dxa"/>
+              <w:bottom w:w="90" w:type="dxa"/>
+              <w:left w:w="120" w:type="dxa"/>
+              <w:right w:w="120" w:type="dxa"/>
             </w:tcMar>
           </w:tcPr>
           <w:p>
             <w:pPr>
-              <w:spacing w:before="40" w:after="40"/>
+              <w:jc w:val="center"/>
             </w:pPr>
             <w:r>
               <w:rPr>
@@ -1823,7 +2379,31 @@
                 <w:color w:val="EF6C00"/>
                 <w:sz w:val="17"/>
               </w:rPr>
-              <w:t>ALTA (8.0/10)</w:t>
+              <w:t>ALTA</w:t>
+              <w:br/>
+              <w:t>(8.5 / 10)</w:t>
+            </w:r>
+          </w:p>
+        </w:tc>
+        <w:tc>
+          <w:tcPr>
+            <w:tcW w:type="dxa" w:w="2304"/>
+            <w:shd w:fill="FFFFFF"/>
+            <w:tcMar>
+              <w:top w:w="90" w:type="dxa"/>
+              <w:bottom w:w="90" w:type="dxa"/>
+              <w:left w:w="120" w:type="dxa"/>
+              <w:right w:w="120" w:type="dxa"/>
+            </w:tcMar>
+          </w:tcPr>
+          <w:p>
+            <w:r>
+              <w:rPr>
+                <w:rFonts w:ascii="Arial" w:hAnsi="Arial"/>
+                <w:color w:val="263238"/>
+                <w:sz w:val="17"/>
+              </w:rPr>
+              <w:t>Operaciones de Cuadrilla y Trazabilidad</w:t>
             </w:r>
           </w:p>
         </w:tc>
@@ -1832,20 +2412,92 @@
             <w:tcW w:type="dxa" w:w="2592"/>
             <w:shd w:fill="FFFFFF"/>
             <w:tcMar>
-              <w:top w:w="80" w:type="dxa"/>
-              <w:bottom w:w="80" w:type="dxa"/>
-              <w:left w:w="90" w:type="dxa"/>
-              <w:right w:w="90" w:type="dxa"/>
+              <w:top w:w="90" w:type="dxa"/>
+              <w:bottom w:w="90" w:type="dxa"/>
+              <w:left w:w="120" w:type="dxa"/>
+              <w:right w:w="120" w:type="dxa"/>
+            </w:tcMar>
+          </w:tcPr>
+          <w:p>
+            <w:r>
+              <w:rPr>
+                <w:rFonts w:ascii="Arial" w:hAnsi="Arial"/>
+                <w:color w:val="263238"/>
+                <w:sz w:val="17"/>
+              </w:rPr>
+              <w:t>Obligación de falsear datos o promediar líneas cuando un sembrador ayuda a otro. Pérdida de auditoría de calidad en campo.</w:t>
+            </w:r>
+          </w:p>
+        </w:tc>
+      </w:tr>
+      <w:tr>
+        <w:tc>
+          <w:tcPr>
+            <w:tcW w:type="dxa" w:w="2592"/>
+            <w:shd w:fill="E8F5E9"/>
+            <w:tcMar>
+              <w:top w:w="90" w:type="dxa"/>
+              <w:bottom w:w="90" w:type="dxa"/>
+              <w:left w:w="120" w:type="dxa"/>
+              <w:right w:w="120" w:type="dxa"/>
+            </w:tcMar>
+          </w:tcPr>
+          <w:p>
+            <w:r>
+              <w:rPr>
+                <w:rFonts w:ascii="Arial" w:hAnsi="Arial"/>
+                <w:b/>
+                <w:color w:val="1B5E20"/>
+                <w:sz w:val="17"/>
+              </w:rPr>
+              <w:t>3. Supresión de Sembrador en Propagación (Madres/Bancos)</w:t>
+            </w:r>
+          </w:p>
+        </w:tc>
+        <w:tc>
+          <w:tcPr>
+            <w:tcW w:type="dxa" w:w="1872"/>
+            <w:shd w:fill="E8F5E9"/>
+            <w:tcMar>
+              <w:top w:w="90" w:type="dxa"/>
+              <w:bottom w:w="90" w:type="dxa"/>
+              <w:left w:w="120" w:type="dxa"/>
+              <w:right w:w="120" w:type="dxa"/>
             </w:tcMar>
           </w:tcPr>
           <w:p>
             <w:pPr>
-              <w:spacing w:before="40" w:after="40"/>
+              <w:jc w:val="center"/>
             </w:pPr>
             <w:r>
               <w:rPr>
                 <w:rFonts w:ascii="Arial" w:hAnsi="Arial"/>
-                <w:color w:val="212121"/>
+                <w:b/>
+                <w:color w:val="EF6C00"/>
+                <w:sz w:val="17"/>
+              </w:rPr>
+              <w:t>ALTA</w:t>
+              <w:br/>
+              <w:t>(8.0 / 10)</w:t>
+            </w:r>
+          </w:p>
+        </w:tc>
+        <w:tc>
+          <w:tcPr>
+            <w:tcW w:type="dxa" w:w="2304"/>
+            <w:shd w:fill="E8F5E9"/>
+            <w:tcMar>
+              <w:top w:w="90" w:type="dxa"/>
+              <w:bottom w:w="90" w:type="dxa"/>
+              <w:left w:w="120" w:type="dxa"/>
+              <w:right w:w="120" w:type="dxa"/>
+            </w:tcMar>
+          </w:tcPr>
+          <w:p>
+            <w:r>
+              <w:rPr>
+                <w:rFonts w:ascii="Arial" w:hAnsi="Arial"/>
+                <w:color w:val="263238"/>
                 <w:sz w:val="17"/>
               </w:rPr>
               <w:t>Catálogo de Empleados y Usabilidad Móvil</w:t>
@@ -1854,26 +2506,23 @@
         </w:tc>
         <w:tc>
           <w:tcPr>
-            <w:tcW w:type="dxa" w:w="3168"/>
-            <w:shd w:fill="FFFFFF"/>
+            <w:tcW w:type="dxa" w:w="2592"/>
+            <w:shd w:fill="E8F5E9"/>
             <w:tcMar>
-              <w:top w:w="80" w:type="dxa"/>
-              <w:bottom w:w="80" w:type="dxa"/>
-              <w:left w:w="90" w:type="dxa"/>
-              <w:right w:w="90" w:type="dxa"/>
+              <w:top w:w="90" w:type="dxa"/>
+              <w:bottom w:w="90" w:type="dxa"/>
+              <w:left w:w="120" w:type="dxa"/>
+              <w:right w:w="120" w:type="dxa"/>
             </w:tcMar>
           </w:tcPr>
           <w:p>
-            <w:pPr>
-              <w:spacing w:before="40" w:after="40"/>
-            </w:pPr>
             <w:r>
               <w:rPr>
                 <w:rFonts w:ascii="Arial" w:hAnsi="Arial"/>
-                <w:color w:val="212121"/>
+                <w:color w:val="263238"/>
                 <w:sz w:val="17"/>
               </w:rPr>
-              <w:t>Obligaría a crear 'empleados ficticios' para registrar labores técnicas. Bloqueo injustificado del formulario.</w:t>
+              <w:t>Obligaría a crear 'empleados ficticios' para registrar labores técnicas. Bloqueo injustificado del formulario de captura.</w:t>
             </w:r>
           </w:p>
         </w:tc>
@@ -1882,42 +2531,40 @@
         <w:tc>
           <w:tcPr>
             <w:tcW w:type="dxa" w:w="2592"/>
-            <w:shd w:fill="FAFAFA"/>
+            <w:shd w:fill="FFFFFF"/>
             <w:tcMar>
-              <w:top w:w="80" w:type="dxa"/>
-              <w:bottom w:w="80" w:type="dxa"/>
-              <w:left w:w="90" w:type="dxa"/>
-              <w:right w:w="90" w:type="dxa"/>
+              <w:top w:w="90" w:type="dxa"/>
+              <w:bottom w:w="90" w:type="dxa"/>
+              <w:left w:w="120" w:type="dxa"/>
+              <w:right w:w="120" w:type="dxa"/>
             </w:tcMar>
           </w:tcPr>
           <w:p>
-            <w:pPr>
-              <w:spacing w:before="40" w:after="40"/>
-            </w:pPr>
             <w:r>
               <w:rPr>
                 <w:rFonts w:ascii="Arial" w:hAnsi="Arial"/>
-                <w:color w:val="212121"/>
+                <w:b/>
+                <w:color w:val="1B5E20"/>
                 <w:sz w:val="17"/>
               </w:rPr>
-              <w:t>Exclusión de Rendimiento en Propagación Especial</w:t>
+              <w:t>4. Exclusión de Rendimiento en Propagación Especial</w:t>
             </w:r>
           </w:p>
         </w:tc>
         <w:tc>
           <w:tcPr>
-            <w:tcW w:type="dxa" w:w="1584"/>
-            <w:shd w:fill="FAFAFA"/>
+            <w:tcW w:type="dxa" w:w="1872"/>
+            <w:shd w:fill="FFFFFF"/>
             <w:tcMar>
-              <w:top w:w="80" w:type="dxa"/>
-              <w:bottom w:w="80" w:type="dxa"/>
-              <w:left w:w="90" w:type="dxa"/>
-              <w:right w:w="90" w:type="dxa"/>
+              <w:top w:w="90" w:type="dxa"/>
+              <w:bottom w:w="90" w:type="dxa"/>
+              <w:left w:w="120" w:type="dxa"/>
+              <w:right w:w="120" w:type="dxa"/>
             </w:tcMar>
           </w:tcPr>
           <w:p>
             <w:pPr>
-              <w:spacing w:before="40" w:after="40"/>
+              <w:jc w:val="center"/>
             </w:pPr>
             <w:r>
               <w:rPr>
@@ -1926,29 +2573,28 @@
                 <w:color w:val="C62828"/>
                 <w:sz w:val="17"/>
               </w:rPr>
-              <w:t>CRÍTICA (9.0/10)</w:t>
+              <w:t>CRÍTICA</w:t>
+              <w:br/>
+              <w:t>(9.0 / 10)</w:t>
             </w:r>
           </w:p>
         </w:tc>
         <w:tc>
           <w:tcPr>
-            <w:tcW w:type="dxa" w:w="2592"/>
-            <w:shd w:fill="FAFAFA"/>
+            <w:tcW w:type="dxa" w:w="2304"/>
+            <w:shd w:fill="FFFFFF"/>
             <w:tcMar>
-              <w:top w:w="80" w:type="dxa"/>
-              <w:bottom w:w="80" w:type="dxa"/>
-              <w:left w:w="90" w:type="dxa"/>
-              <w:right w:w="90" w:type="dxa"/>
+              <w:top w:w="90" w:type="dxa"/>
+              <w:bottom w:w="90" w:type="dxa"/>
+              <w:left w:w="120" w:type="dxa"/>
+              <w:right w:w="120" w:type="dxa"/>
             </w:tcMar>
           </w:tcPr>
           <w:p>
-            <w:pPr>
-              <w:spacing w:before="40" w:after="40"/>
-            </w:pPr>
             <w:r>
               <w:rPr>
                 <w:rFonts w:ascii="Arial" w:hAnsi="Arial"/>
-                <w:color w:val="212121"/>
+                <w:color w:val="263238"/>
                 <w:sz w:val="17"/>
               </w:rPr>
               <w:t>Evaluación de Desempeño y Bonificaciones</w:t>
@@ -1957,23 +2603,20 @@
         </w:tc>
         <w:tc>
           <w:tcPr>
-            <w:tcW w:type="dxa" w:w="3168"/>
-            <w:shd w:fill="FAFAFA"/>
+            <w:tcW w:type="dxa" w:w="2592"/>
+            <w:shd w:fill="FFFFFF"/>
             <w:tcMar>
-              <w:top w:w="80" w:type="dxa"/>
-              <w:bottom w:w="80" w:type="dxa"/>
-              <w:left w:w="90" w:type="dxa"/>
-              <w:right w:w="90" w:type="dxa"/>
+              <w:top w:w="90" w:type="dxa"/>
+              <w:bottom w:w="90" w:type="dxa"/>
+              <w:left w:w="120" w:type="dxa"/>
+              <w:right w:w="120" w:type="dxa"/>
             </w:tcMar>
           </w:tcPr>
           <w:p>
-            <w:pPr>
-              <w:spacing w:before="40" w:after="40"/>
-            </w:pPr>
             <w:r>
               <w:rPr>
                 <w:rFonts w:ascii="Arial" w:hAnsi="Arial"/>
-                <w:color w:val="212121"/>
+                <w:color w:val="263238"/>
                 <w:sz w:val="17"/>
               </w:rPr>
               <w:t>Distorsión grave de rankings de sembradores. Operarios técnicos aparecerían con pésimo rendimiento injustamente.</w:t>
@@ -1985,42 +2628,40 @@
         <w:tc>
           <w:tcPr>
             <w:tcW w:type="dxa" w:w="2592"/>
-            <w:shd w:fill="FFFFFF"/>
+            <w:shd w:fill="E8F5E9"/>
             <w:tcMar>
-              <w:top w:w="80" w:type="dxa"/>
-              <w:bottom w:w="80" w:type="dxa"/>
-              <w:left w:w="90" w:type="dxa"/>
-              <w:right w:w="90" w:type="dxa"/>
+              <w:top w:w="90" w:type="dxa"/>
+              <w:bottom w:w="90" w:type="dxa"/>
+              <w:left w:w="120" w:type="dxa"/>
+              <w:right w:w="120" w:type="dxa"/>
             </w:tcMar>
           </w:tcPr>
           <w:p>
-            <w:pPr>
-              <w:spacing w:before="40" w:after="40"/>
-            </w:pPr>
             <w:r>
               <w:rPr>
                 <w:rFonts w:ascii="Arial" w:hAnsi="Arial"/>
-                <w:color w:val="212121"/>
+                <w:b/>
+                <w:color w:val="1B5E20"/>
                 <w:sz w:val="17"/>
               </w:rPr>
-              <w:t>Bloqueo Temporal de Inmutabilidad a 2 Días</w:t>
+              <w:t>5. Bloqueo Temporal de Inmutabilidad a 2 Días</w:t>
             </w:r>
           </w:p>
         </w:tc>
         <w:tc>
           <w:tcPr>
-            <w:tcW w:type="dxa" w:w="1584"/>
-            <w:shd w:fill="FFFFFF"/>
+            <w:tcW w:type="dxa" w:w="1872"/>
+            <w:shd w:fill="E8F5E9"/>
             <w:tcMar>
-              <w:top w:w="80" w:type="dxa"/>
-              <w:bottom w:w="80" w:type="dxa"/>
-              <w:left w:w="90" w:type="dxa"/>
-              <w:right w:w="90" w:type="dxa"/>
+              <w:top w:w="90" w:type="dxa"/>
+              <w:bottom w:w="90" w:type="dxa"/>
+              <w:left w:w="120" w:type="dxa"/>
+              <w:right w:w="120" w:type="dxa"/>
             </w:tcMar>
           </w:tcPr>
           <w:p>
             <w:pPr>
-              <w:spacing w:before="40" w:after="40"/>
+              <w:jc w:val="center"/>
             </w:pPr>
             <w:r>
               <w:rPr>
@@ -2029,7 +2670,128 @@
                 <w:color w:val="C62828"/>
                 <w:sz w:val="17"/>
               </w:rPr>
-              <w:t>CRÍTICA (10.0/10)</w:t>
+              <w:t>CRÍTICA</w:t>
+              <w:br/>
+              <w:t>(10.0 / 10)</w:t>
+            </w:r>
+          </w:p>
+        </w:tc>
+        <w:tc>
+          <w:tcPr>
+            <w:tcW w:type="dxa" w:w="2304"/>
+            <w:shd w:fill="E8F5E9"/>
+            <w:tcMar>
+              <w:top w:w="90" w:type="dxa"/>
+              <w:bottom w:w="90" w:type="dxa"/>
+              <w:left w:w="120" w:type="dxa"/>
+              <w:right w:w="120" w:type="dxa"/>
+            </w:tcMar>
+          </w:tcPr>
+          <w:p>
+            <w:r>
+              <w:rPr>
+                <w:rFonts w:ascii="Arial" w:hAnsi="Arial"/>
+                <w:color w:val="263238"/>
+                <w:sz w:val="17"/>
+              </w:rPr>
+              <w:t>Gobernanza de Datos, ERP y Auditoría Contable</w:t>
+            </w:r>
+          </w:p>
+        </w:tc>
+        <w:tc>
+          <w:tcPr>
+            <w:tcW w:type="dxa" w:w="2592"/>
+            <w:shd w:fill="E8F5E9"/>
+            <w:tcMar>
+              <w:top w:w="90" w:type="dxa"/>
+              <w:bottom w:w="90" w:type="dxa"/>
+              <w:left w:w="120" w:type="dxa"/>
+              <w:right w:w="120" w:type="dxa"/>
+            </w:tcMar>
+          </w:tcPr>
+          <w:p>
+            <w:r>
+              <w:rPr>
+                <w:rFonts w:ascii="Arial" w:hAnsi="Arial"/>
+                <w:color w:val="263238"/>
+                <w:sz w:val="17"/>
+              </w:rPr>
+              <w:t>Riesgo de fraude, borrado accidental de siembras históricas y desincronización caótica con Microsoft Access.</w:t>
+            </w:r>
+          </w:p>
+        </w:tc>
+      </w:tr>
+      <w:tr>
+        <w:tc>
+          <w:tcPr>
+            <w:tcW w:type="dxa" w:w="2592"/>
+            <w:shd w:fill="FFFFFF"/>
+            <w:tcMar>
+              <w:top w:w="90" w:type="dxa"/>
+              <w:bottom w:w="90" w:type="dxa"/>
+              <w:left w:w="120" w:type="dxa"/>
+              <w:right w:w="120" w:type="dxa"/>
+            </w:tcMar>
+          </w:tcPr>
+          <w:p>
+            <w:r>
+              <w:rPr>
+                <w:rFonts w:ascii="Arial" w:hAnsi="Arial"/>
+                <w:b/>
+                <w:color w:val="1B5E20"/>
+                <w:sz w:val="17"/>
+              </w:rPr>
+              <w:t>6. Gamificación, Podio y Reportes PDF</w:t>
+            </w:r>
+          </w:p>
+        </w:tc>
+        <w:tc>
+          <w:tcPr>
+            <w:tcW w:type="dxa" w:w="1872"/>
+            <w:shd w:fill="FFFFFF"/>
+            <w:tcMar>
+              <w:top w:w="90" w:type="dxa"/>
+              <w:bottom w:w="90" w:type="dxa"/>
+              <w:left w:w="120" w:type="dxa"/>
+              <w:right w:w="120" w:type="dxa"/>
+            </w:tcMar>
+          </w:tcPr>
+          <w:p>
+            <w:pPr>
+              <w:jc w:val="center"/>
+            </w:pPr>
+            <w:r>
+              <w:rPr>
+                <w:rFonts w:ascii="Arial" w:hAnsi="Arial"/>
+                <w:b/>
+                <w:color w:val="EF6C00"/>
+                <w:sz w:val="17"/>
+              </w:rPr>
+              <w:t>MEDIA-ALTA</w:t>
+              <w:br/>
+              <w:t>(7.5 / 10)</w:t>
+            </w:r>
+          </w:p>
+        </w:tc>
+        <w:tc>
+          <w:tcPr>
+            <w:tcW w:type="dxa" w:w="2304"/>
+            <w:shd w:fill="FFFFFF"/>
+            <w:tcMar>
+              <w:top w:w="90" w:type="dxa"/>
+              <w:bottom w:w="90" w:type="dxa"/>
+              <w:left w:w="120" w:type="dxa"/>
+              <w:right w:w="120" w:type="dxa"/>
+            </w:tcMar>
+          </w:tcPr>
+          <w:p>
+            <w:r>
+              <w:rPr>
+                <w:rFonts w:ascii="Arial" w:hAnsi="Arial"/>
+                <w:color w:val="263238"/>
+                <w:sz w:val="17"/>
+              </w:rPr>
+              <w:t>Supervisión Diaria y Motivación Laboral</w:t>
             </w:r>
           </w:p>
         </w:tc>
@@ -2038,48 +2800,117 @@
             <w:tcW w:type="dxa" w:w="2592"/>
             <w:shd w:fill="FFFFFF"/>
             <w:tcMar>
-              <w:top w:w="80" w:type="dxa"/>
-              <w:bottom w:w="80" w:type="dxa"/>
-              <w:left w:w="90" w:type="dxa"/>
-              <w:right w:w="90" w:type="dxa"/>
+              <w:top w:w="90" w:type="dxa"/>
+              <w:bottom w:w="90" w:type="dxa"/>
+              <w:left w:w="120" w:type="dxa"/>
+              <w:right w:w="120" w:type="dxa"/>
             </w:tcMar>
           </w:tcPr>
           <w:p>
-            <w:pPr>
-              <w:spacing w:before="40" w:after="40"/>
-            </w:pPr>
             <w:r>
               <w:rPr>
                 <w:rFonts w:ascii="Arial" w:hAnsi="Arial"/>
-                <w:color w:val="212121"/>
+                <w:color w:val="263238"/>
                 <w:sz w:val="17"/>
               </w:rPr>
-              <w:t>Gobernanza de Datos, ERP y Auditoría Contable</w:t>
+              <w:t>Pérdida de motivación y clima competitivo. Retorno a transcripción manual de reportes en papel o Excel.</w:t>
+            </w:r>
+          </w:p>
+        </w:tc>
+      </w:tr>
+      <w:tr>
+        <w:tc>
+          <w:tcPr>
+            <w:tcW w:type="dxa" w:w="2592"/>
+            <w:shd w:fill="FFF3E0"/>
+            <w:tcMar>
+              <w:top w:w="90" w:type="dxa"/>
+              <w:bottom w:w="90" w:type="dxa"/>
+              <w:left w:w="120" w:type="dxa"/>
+              <w:right w:w="120" w:type="dxa"/>
+            </w:tcMar>
+          </w:tcPr>
+          <w:p>
+            <w:r>
+              <w:rPr>
+                <w:rFonts w:ascii="Arial" w:hAnsi="Arial"/>
+                <w:b/>
+                <w:color w:val="1B5E20"/>
+                <w:sz w:val="17"/>
+              </w:rPr>
+              <w:t>7. Servidor Backend e Iniciar Backend (iniciar_backend.bat)</w:t>
             </w:r>
           </w:p>
         </w:tc>
         <w:tc>
           <w:tcPr>
-            <w:tcW w:type="dxa" w:w="3168"/>
-            <w:shd w:fill="FFFFFF"/>
+            <w:tcW w:type="dxa" w:w="1872"/>
+            <w:shd w:fill="FFF3E0"/>
             <w:tcMar>
-              <w:top w:w="80" w:type="dxa"/>
-              <w:bottom w:w="80" w:type="dxa"/>
-              <w:left w:w="90" w:type="dxa"/>
-              <w:right w:w="90" w:type="dxa"/>
+              <w:top w:w="90" w:type="dxa"/>
+              <w:bottom w:w="90" w:type="dxa"/>
+              <w:left w:w="120" w:type="dxa"/>
+              <w:right w:w="120" w:type="dxa"/>
             </w:tcMar>
           </w:tcPr>
           <w:p>
             <w:pPr>
-              <w:spacing w:before="40" w:after="40"/>
+              <w:jc w:val="center"/>
             </w:pPr>
             <w:r>
               <w:rPr>
                 <w:rFonts w:ascii="Arial" w:hAnsi="Arial"/>
-                <w:color w:val="212121"/>
+                <w:b/>
+                <w:color w:val="D50000"/>
                 <w:sz w:val="17"/>
               </w:rPr>
-              <w:t>Riesgo de fraude, borrado accidental de siembras históricas y desincronización caótica con Microsoft Access.</w:t>
+              <w:t>CRÍTICA ABSOLUTA</w:t>
+              <w:br/>
+              <w:t>(10.0 / 10)</w:t>
+            </w:r>
+          </w:p>
+        </w:tc>
+        <w:tc>
+          <w:tcPr>
+            <w:tcW w:type="dxa" w:w="2304"/>
+            <w:shd w:fill="FFF3E0"/>
+            <w:tcMar>
+              <w:top w:w="90" w:type="dxa"/>
+              <w:bottom w:w="90" w:type="dxa"/>
+              <w:left w:w="120" w:type="dxa"/>
+              <w:right w:w="120" w:type="dxa"/>
+            </w:tcMar>
+          </w:tcPr>
+          <w:p>
+            <w:r>
+              <w:rPr>
+                <w:rFonts w:ascii="Arial" w:hAnsi="Arial"/>
+                <w:color w:val="263238"/>
+                <w:sz w:val="17"/>
+              </w:rPr>
+              <w:t>Infraestructura, Conectividad y Base de Datos Access</w:t>
+            </w:r>
+          </w:p>
+        </w:tc>
+        <w:tc>
+          <w:tcPr>
+            <w:tcW w:type="dxa" w:w="2592"/>
+            <w:shd w:fill="FFF3E0"/>
+            <w:tcMar>
+              <w:top w:w="90" w:type="dxa"/>
+              <w:bottom w:w="90" w:type="dxa"/>
+              <w:left w:w="120" w:type="dxa"/>
+              <w:right w:w="120" w:type="dxa"/>
+            </w:tcMar>
+          </w:tcPr>
+          <w:p>
+            <w:r>
+              <w:rPr>
+                <w:rFonts w:ascii="Arial" w:hAnsi="Arial"/>
+                <w:color w:val="263238"/>
+                <w:sz w:val="17"/>
+              </w:rPr>
+              <w:t>Incomunicación total de celulares. Imposibilidad de sincronizar con Access. Riesgo fatal de corrupción de la BD de 865 MB.</w:t>
             </w:r>
           </w:p>
         </w:tc>
@@ -2087,37 +2918,54 @@
     </w:tbl>
     <w:p>
       <w:pPr>
-        <w:spacing w:after="240"/>
+        <w:spacing w:before="160" w:after="160"/>
       </w:pPr>
     </w:p>
     <w:p>
+      <w:pPr>
+        <w:keepNext/>
+        <w:spacing w:before="280" w:after="120"/>
+      </w:pPr>
       <w:r>
         <w:rPr>
           <w:rFonts w:ascii="Arial" w:hAnsi="Arial"/>
           <w:b/>
           <w:color w:val="1B5E20"/>
-          <w:sz w:val="30"/>
+          <w:sz w:val="28"/>
         </w:rPr>
-        <w:t>8. Conclusiones y Dictamen de Calidad de Software</w:t>
+        <w:t>9. Conclusiones, Arquitectura Integral y Dictamen de Calidad de Software</w:t>
       </w:r>
     </w:p>
     <w:p>
+      <w:pPr>
+        <w:spacing w:before="40" w:after="100" w:line="276" w:lineRule="auto"/>
+      </w:pPr>
       <w:r>
-        <w:t>Cada uno de los componentes analizados en este informe responde a una necesidad agronómica, operativa o de gobernanza concreta de Buenavista Flowers. No existen funcionalidades accesorias o redundantes en la arquitectura del sistema:</w:t>
+        <w:rPr>
+          <w:rFonts w:ascii="Arial" w:hAnsi="Arial"/>
+          <w:color w:val="263238"/>
+          <w:sz w:val="19"/>
+        </w:rPr>
+        <w:t>Cada uno de los 7 componentes analizados en este informe técnico responde a una necesidad agronómica, operativa, de infraestructura o de gobernanza concreta de Buenavista Flowers. No existen funcionalidades accesorias o redundantes en la arquitectura del sistema:</w:t>
         <w:br/>
-        <w:t>• La sinergia entre la partición bilateral (13/12 y 11/11) y el modo mixto 'Pasó al otro lado' garantiza que la aplicación móvil refleje la realidad física del invernadero con 100% de precisión matemática.</w:t>
         <w:br/>
-        <w:t>• El desacoplamiento y exclusión de plantas madre, bancos y núcleos preserva la pureza de la nómina y de los KPIs de productividad.</w:t>
+        <w:t>• Sinergia Matemática y Física: La combinación de la división bilateral (13/12 y 11/11) junto al régimen transversal 'Pasó al otro lado' garantiza que la aplicación móvil refleje exactamente la realidad física del invernadero con 100% de precisión matemática.</w:t>
         <w:br/>
-        <w:t>• La regla de inmutabilidad a 2 días protege el patrimonio contable de la empresa evitando alteraciones retroactivas no autorizadas.</w:t>
+        <w:t>• Pureza de Nómina y Rendimiento: El desacoplamiento y exclusión de plantas madre, bancos y núcleos preserva la legitimidad de las tablas salariales y evita castigar injustamente a operarios calificados en labores técnicas de propagación.</w:t>
         <w:br/>
-        <w:t>El sistema en su versión actual v1.1.0 ha sido validado satisfactoriamente en hardware real (Motorola Moto G52) y representa un estándar de excelencia en ingeniería de software aplicada a la agroindustria de exportación.</w:t>
+        <w:t>• Blindaje y Gobernanza Contable: La regla de inmutabilidad a 2 días (48 horas) congela los datos móviles y centraliza las correcciones de auditoría en Microsoft Access.</w:t>
+        <w:br/>
+        <w:t>• Robustez de Infraestructura Backend: El servidor FastAPI con 'iniciar_backend.bat' actúa como el corazón del sistema, habilitando la arquitectura Offline-First y protegiendo la base de datos empresarial de 865 MB contra concurrencias destructivas mediante 'db_lock' y respaldos continuos en 'backups_seguridad/'.</w:t>
+        <w:br/>
+        <w:br/>
+        <w:t>El sistema integral en su versión de producción v1.1.0 ha sido verificado satisfactoriamente en hardware real (Motorola Moto G52) y en el servidor local de Windows, certificando su estabilidad, fiabilidad y preparación para operaciones continuas de exportación.</w:t>
       </w:r>
     </w:p>
     <w:tbl>
       <w:tblPr>
         <w:tblW w:type="auto" w:w="0"/>
         <w:jc w:val="center"/>
+        <w:tblLayout w:type="fixed"/>
         <w:tblLook w:firstColumn="1" w:firstRow="1" w:lastColumn="0" w:lastRow="0" w:noHBand="0" w:noVBand="1" w:val="04A0"/>
       </w:tblPr>
       <w:tblGrid>
@@ -2129,15 +2977,21 @@
             <w:tcW w:type="dxa" w:w="9360"/>
             <w:shd w:fill="E8F5E9"/>
             <w:tcMar>
-              <w:top w:w="120" w:type="dxa"/>
-              <w:bottom w:w="120" w:type="dxa"/>
-              <w:left w:w="150" w:type="dxa"/>
-              <w:right w:w="150" w:type="dxa"/>
+              <w:top w:w="140" w:type="dxa"/>
+              <w:bottom w:w="140" w:type="dxa"/>
+              <w:left w:w="200" w:type="dxa"/>
+              <w:right w:w="200" w:type="dxa"/>
             </w:tcMar>
+            <w:tcBorders>
+              <w:left w:val="single" w:sz="36" w:space="0" w:color="2E7D32"/>
+              <w:top w:val="none"/>
+              <w:right w:val="none"/>
+              <w:bottom w:val="none"/>
+            </w:tcBorders>
           </w:tcPr>
           <w:p>
             <w:pPr>
-              <w:jc w:val="center"/>
+              <w:spacing w:before="40" w:after="40"/>
             </w:pPr>
             <w:r>
               <w:rPr>
@@ -2149,10 +3003,15 @@
               <w:t>CERTIFICACIÓN Y CONFORMIDAD TÉCNICA DE DESARROLLO</w:t>
               <w:br/>
             </w:r>
+          </w:p>
+          <w:p>
+            <w:pPr>
+              <w:spacing w:before="40" w:after="40" w:line="276" w:lineRule="auto"/>
+            </w:pPr>
             <w:r>
               <w:rPr>
                 <w:rFonts w:ascii="Arial" w:hAnsi="Arial"/>
-                <w:color w:val="333333"/>
+                <w:color w:val="263238"/>
                 <w:sz w:val="19"/>
               </w:rPr>
               <w:t>Ingeniero de Software: Fernan Julián Pérez Gutiérrez (@FernanJPG1)</w:t>
@@ -2160,6 +3019,8 @@
               <w:t>Contacto: fernansecr@gmail.com • Departamento de Tecnología Buenavista Flowers</w:t>
               <w:br/>
               <w:t>Fecha de Emisión: Octubre 6 de 2026 • Estado: Documento Aprobado y Certificado</w:t>
+              <w:br/>
+              <w:t>Repositorio Oficial: FernanJPG1/PROYECTO_SIEMBRAS (Branch: main)</w:t>
             </w:r>
           </w:p>
         </w:tc>

</xml_diff>